<commit_message>
About page laid out again for big screens
"the rest need to be ordered good especially in big screens ... easy to spot the business information": after the film the About page is one centred column, and every section follows the Who we are pattern - the words on the left, the facts in a card on the right. How we work is four steps on one line joined by a wood line (two by two on tablets, down a line on phones); Our purpose sets the mission and vision as statements beside a What we stand for card; Where to find us has the address, the map pin button and a Reach us card with the company phone, WhatsApp, email and socials; the founder card is centred. Website User Interface document updated.

Co-Authored-By: Claude Opus 5.5 <noreply@anthropic.com>
</commit_message>
<xml_diff>
--- a/documentation/04 Website/Website User Interface.docx
+++ b/documentation/04 Website/Website User Interface.docx
@@ -80,7 +80,7 @@
           <w:left w:w="10" w:type="dxa"/>
           <w:right w:w="10" w:type="dxa"/>
         </w:tblCellMar>
-        <w:tblLook w:val="0000" w:firstRow="0" w:lastRow="0" w:firstColumn="0" w:lastColumn="0" w:noHBand="0" w:noVBand="0"/>
+        <w:tblLook w:val="04A0" w:firstRow="1" w:lastRow="0" w:firstColumn="1" w:lastColumn="0" w:noHBand="0" w:noVBand="1"/>
       </w:tblPr>
       <w:tblGrid>
         <w:gridCol w:w="2600"/>
@@ -461,7 +461,7 @@
           <w:left w:w="10" w:type="dxa"/>
           <w:right w:w="10" w:type="dxa"/>
         </w:tblCellMar>
-        <w:tblLook w:val="0000" w:firstRow="0" w:lastRow="0" w:firstColumn="0" w:lastColumn="0" w:noHBand="0" w:noVBand="0"/>
+        <w:tblLook w:val="04A0" w:firstRow="1" w:lastRow="0" w:firstColumn="1" w:lastColumn="0" w:noHBand="0" w:noVBand="1"/>
       </w:tblPr>
       <w:tblGrid>
         <w:gridCol w:w="1300"/>
@@ -1251,14 +1251,7 @@
                 <w:sz w:val="19"/>
                 <w:szCs w:val="19"/>
               </w:rPr>
-              <w:t>The "Living Forest" colours, chosen by the board for a livelier green: a deeper, cleaner page green and lighter raised surfaces, the same in the phone and desktop apps. The cooki</w:t>
-            </w:r>
-            <w:r>
-              <w:rPr>
-                <w:sz w:val="19"/>
-                <w:szCs w:val="19"/>
-              </w:rPr>
-              <w:t>e banner's Customize is a wood link instead of a warning red.</w:t>
+              <w:t>The "Living Forest" colours, chosen by the board for a livelier green: a deeper, cleaner page green and lighter raised surfaces, the same in the phone and desktop apps. The cookie banner's Customize is a wood link instead of a warning red.</w:t>
             </w:r>
           </w:p>
         </w:tc>
@@ -1306,7 +1299,14 @@
                 <w:sz w:val="19"/>
                 <w:szCs w:val="19"/>
               </w:rPr>
-              <w:t>20 October 2026</w:t>
+              <w:t xml:space="preserve">20 October </w:t>
+            </w:r>
+            <w:r>
+              <w:rPr>
+                <w:sz w:val="19"/>
+                <w:szCs w:val="19"/>
+              </w:rPr>
+              <w:t>2026</w:t>
             </w:r>
           </w:p>
         </w:tc>
@@ -1326,14 +1326,14 @@
                 <w:sz w:val="19"/>
                 <w:szCs w:val="19"/>
               </w:rPr>
-              <w:t>Colour themes: Forest (the default), Dark and Light from the Theme menu at the end of the top links, remembered in the browser and, for a signed-in customer, with the account. The product grid and the Featured banner fill the page at any width, the cards g</w:t>
-            </w:r>
-            <w:r>
-              <w:rPr>
-                <w:sz w:val="19"/>
-                <w:szCs w:val="19"/>
-              </w:rPr>
-              <w:t>rowing with the screen.</w:t>
+              <w:t>Colour themes: Forest (the default), Dark and Light from the Theme menu at the end of the top links, remembered in the browser and, for a signed-in customer, with the account. The product grid and the Featured banner fill the page at any width, the ca</w:t>
+            </w:r>
+            <w:r>
+              <w:rPr>
+                <w:sz w:val="19"/>
+                <w:szCs w:val="19"/>
+              </w:rPr>
+              <w:t>rds growing with the screen.</w:t>
             </w:r>
           </w:p>
         </w:tc>
@@ -1401,14 +1401,14 @@
                 <w:sz w:val="19"/>
                 <w:szCs w:val="19"/>
               </w:rPr>
-              <w:t>The About page sets out the company below the film: who we are with the registered facts, how we work (timber from farms across Central Kenya, milled in Nakuru), mission and vision, where to find us with a map l</w:t>
-            </w:r>
-            <w:r>
-              <w:rPr>
-                <w:sz w:val="19"/>
-                <w:szCs w:val="19"/>
-              </w:rPr>
-              <w:t>ink, and the founder with a photo frame; the same facts for search engines in index.html.</w:t>
+              <w:t xml:space="preserve">The About page sets out the company below the film: who we are with the registered facts, how we work (timber from farms across Central Kenya, milled in Nakuru), mission and vision, where to find us with a </w:t>
+            </w:r>
+            <w:r>
+              <w:rPr>
+                <w:sz w:val="19"/>
+                <w:szCs w:val="19"/>
+              </w:rPr>
+              <w:t>map link, and the founder with a photo frame; the same facts for search engines in index.html.</w:t>
             </w:r>
           </w:p>
         </w:tc>
@@ -1476,14 +1476,14 @@
                 <w:sz w:val="19"/>
                 <w:szCs w:val="19"/>
               </w:rPr>
-              <w:t>Order tickets (DW-7K3Q9P) on the payment screen, the order page and Ordered Goods; Track my order without signing in (the ticket and the last 3 d</w:t>
-            </w:r>
-            <w:r>
-              <w:rPr>
-                <w:sz w:val="19"/>
-                <w:szCs w:val="19"/>
-              </w:rPr>
-              <w:t>igits of the phone); the driver and number plate show only when staff share them for that delivery.</w:t>
+              <w:t>Order tickets (DW-7K3Q9P) on the payment screen, the order page and Ordered Goods; Track my order without signing in (the ticket and the las</w:t>
+            </w:r>
+            <w:r>
+              <w:rPr>
+                <w:sz w:val="19"/>
+                <w:szCs w:val="19"/>
+              </w:rPr>
+              <w:t>t 3 digits of the phone); the driver and number plate show only when staff share them for that delivery.</w:t>
             </w:r>
           </w:p>
         </w:tc>
@@ -1520,7 +1520,7 @@
     <w:sdt>
       <w:sdtPr>
         <w:alias w:val="Contents"/>
-        <w:id w:val="583495787"/>
+        <w:id w:val="-1638564783"/>
       </w:sdtPr>
       <w:sdtEndPr/>
       <w:sdtContent>
@@ -1542,15 +1542,12 @@
             <w:fldChar w:fldCharType="begin"/>
           </w:r>
           <w:r>
-            <w:instrText>TOC \h</w:instrText>
-          </w:r>
-          <w:r>
-            <w:instrText xml:space="preserve"> \o "1-2"</w:instrText>
+            <w:instrText>TOC \h \o "1-2"</w:instrText>
           </w:r>
           <w:r>
             <w:fldChar w:fldCharType="separate"/>
           </w:r>
-          <w:hyperlink w:anchor="_Toc243679753" w:history="1">
+          <w:hyperlink w:anchor="_Toc243680522" w:history="1">
             <w:r>
               <w:rPr>
                 <w:rStyle w:val="Hyperlink"/>
@@ -1574,7 +1571,7 @@
               <w:rPr>
                 <w:noProof/>
               </w:rPr>
-              <w:instrText xml:space="preserve"> PAGEREF _Toc243679753 \h </w:instrText>
+              <w:instrText xml:space="preserve"> PAGEREF _Toc243680522 \h </w:instrText>
             </w:r>
             <w:r>
               <w:rPr>
@@ -1615,7 +1612,7 @@
               <w:szCs w:val="22"/>
             </w:rPr>
           </w:pPr>
-          <w:hyperlink w:anchor="_Toc243679754" w:history="1">
+          <w:hyperlink w:anchor="_Toc243680523" w:history="1">
             <w:r>
               <w:rPr>
                 <w:rStyle w:val="Hyperlink"/>
@@ -1639,7 +1636,7 @@
               <w:rPr>
                 <w:noProof/>
               </w:rPr>
-              <w:instrText xml:space="preserve"> PAGEREF _Toc243679754 \h </w:instrText>
+              <w:instrText xml:space="preserve"> PAGEREF _Toc243680523 \h </w:instrText>
             </w:r>
             <w:r>
               <w:rPr>
@@ -1680,7 +1677,7 @@
               <w:szCs w:val="22"/>
             </w:rPr>
           </w:pPr>
-          <w:hyperlink w:anchor="_Toc243679755" w:history="1">
+          <w:hyperlink w:anchor="_Toc243680524" w:history="1">
             <w:r>
               <w:rPr>
                 <w:rStyle w:val="Hyperlink"/>
@@ -1704,7 +1701,7 @@
               <w:rPr>
                 <w:noProof/>
               </w:rPr>
-              <w:instrText xml:space="preserve"> PAGEREF _Toc243679755 \h </w:instrText>
+              <w:instrText xml:space="preserve"> PAGEREF _Toc243680524 \h </w:instrText>
             </w:r>
             <w:r>
               <w:rPr>
@@ -1745,7 +1742,7 @@
               <w:szCs w:val="22"/>
             </w:rPr>
           </w:pPr>
-          <w:hyperlink w:anchor="_Toc243679756" w:history="1">
+          <w:hyperlink w:anchor="_Toc243680525" w:history="1">
             <w:r>
               <w:rPr>
                 <w:rStyle w:val="Hyperlink"/>
@@ -1769,7 +1766,7 @@
               <w:rPr>
                 <w:noProof/>
               </w:rPr>
-              <w:instrText xml:space="preserve"> PAGEREF _Toc243679756 \h </w:instrText>
+              <w:instrText xml:space="preserve"> PAGEREF _Toc243680525 \h </w:instrText>
             </w:r>
             <w:r>
               <w:rPr>
@@ -1810,7 +1807,7 @@
               <w:szCs w:val="22"/>
             </w:rPr>
           </w:pPr>
-          <w:hyperlink w:anchor="_Toc243679757" w:history="1">
+          <w:hyperlink w:anchor="_Toc243680526" w:history="1">
             <w:r>
               <w:rPr>
                 <w:rStyle w:val="Hyperlink"/>
@@ -1834,7 +1831,7 @@
               <w:rPr>
                 <w:noProof/>
               </w:rPr>
-              <w:instrText xml:space="preserve"> PAGEREF _Toc243679757 \h </w:instrText>
+              <w:instrText xml:space="preserve"> PAGEREF _Toc243680526 \h </w:instrText>
             </w:r>
             <w:r>
               <w:rPr>
@@ -1875,7 +1872,7 @@
               <w:szCs w:val="22"/>
             </w:rPr>
           </w:pPr>
-          <w:hyperlink w:anchor="_Toc243679758" w:history="1">
+          <w:hyperlink w:anchor="_Toc243680527" w:history="1">
             <w:r>
               <w:rPr>
                 <w:rStyle w:val="Hyperlink"/>
@@ -1899,7 +1896,7 @@
               <w:rPr>
                 <w:noProof/>
               </w:rPr>
-              <w:instrText xml:space="preserve"> PAGEREF _Toc243679758 \h </w:instrText>
+              <w:instrText xml:space="preserve"> PAGEREF _Toc243680527 \h </w:instrText>
             </w:r>
             <w:r>
               <w:rPr>
@@ -1940,7 +1937,7 @@
               <w:szCs w:val="22"/>
             </w:rPr>
           </w:pPr>
-          <w:hyperlink w:anchor="_Toc243679759" w:history="1">
+          <w:hyperlink w:anchor="_Toc243680528" w:history="1">
             <w:r>
               <w:rPr>
                 <w:rStyle w:val="Hyperlink"/>
@@ -1964,7 +1961,7 @@
               <w:rPr>
                 <w:noProof/>
               </w:rPr>
-              <w:instrText xml:space="preserve"> PAGEREF _Toc243679759 \h </w:instrText>
+              <w:instrText xml:space="preserve"> PAGEREF _Toc243680528 \h </w:instrText>
             </w:r>
             <w:r>
               <w:rPr>
@@ -2005,7 +2002,7 @@
               <w:szCs w:val="22"/>
             </w:rPr>
           </w:pPr>
-          <w:hyperlink w:anchor="_Toc243679760" w:history="1">
+          <w:hyperlink w:anchor="_Toc243680529" w:history="1">
             <w:r>
               <w:rPr>
                 <w:rStyle w:val="Hyperlink"/>
@@ -2029,7 +2026,7 @@
               <w:rPr>
                 <w:noProof/>
               </w:rPr>
-              <w:instrText xml:space="preserve"> PAGEREF _Toc243679760 \h </w:instrText>
+              <w:instrText xml:space="preserve"> PAGEREF _Toc243680529 \h </w:instrText>
             </w:r>
             <w:r>
               <w:rPr>
@@ -2070,7 +2067,7 @@
               <w:szCs w:val="22"/>
             </w:rPr>
           </w:pPr>
-          <w:hyperlink w:anchor="_Toc243679761" w:history="1">
+          <w:hyperlink w:anchor="_Toc243680530" w:history="1">
             <w:r>
               <w:rPr>
                 <w:rStyle w:val="Hyperlink"/>
@@ -2094,7 +2091,7 @@
               <w:rPr>
                 <w:noProof/>
               </w:rPr>
-              <w:instrText xml:space="preserve"> PAGEREF _Toc243679761 \h </w:instrText>
+              <w:instrText xml:space="preserve"> PAGEREF _Toc243680530 \h </w:instrText>
             </w:r>
             <w:r>
               <w:rPr>
@@ -2135,7 +2132,7 @@
               <w:szCs w:val="22"/>
             </w:rPr>
           </w:pPr>
-          <w:hyperlink w:anchor="_Toc243679762" w:history="1">
+          <w:hyperlink w:anchor="_Toc243680531" w:history="1">
             <w:r>
               <w:rPr>
                 <w:rStyle w:val="Hyperlink"/>
@@ -2159,7 +2156,7 @@
               <w:rPr>
                 <w:noProof/>
               </w:rPr>
-              <w:instrText xml:space="preserve"> PAGEREF _Toc243679762 \h </w:instrText>
+              <w:instrText xml:space="preserve"> PAGEREF _Toc243680531 \h </w:instrText>
             </w:r>
             <w:r>
               <w:rPr>
@@ -2200,7 +2197,7 @@
               <w:szCs w:val="22"/>
             </w:rPr>
           </w:pPr>
-          <w:hyperlink w:anchor="_Toc243679763" w:history="1">
+          <w:hyperlink w:anchor="_Toc243680532" w:history="1">
             <w:r>
               <w:rPr>
                 <w:rStyle w:val="Hyperlink"/>
@@ -2224,7 +2221,7 @@
               <w:rPr>
                 <w:noProof/>
               </w:rPr>
-              <w:instrText xml:space="preserve"> PAGEREF _Toc243679763 \h </w:instrText>
+              <w:instrText xml:space="preserve"> PAGEREF _Toc243680532 \h </w:instrText>
             </w:r>
             <w:r>
               <w:rPr>
@@ -2265,7 +2262,7 @@
               <w:szCs w:val="22"/>
             </w:rPr>
           </w:pPr>
-          <w:hyperlink w:anchor="_Toc243679764" w:history="1">
+          <w:hyperlink w:anchor="_Toc243680533" w:history="1">
             <w:r>
               <w:rPr>
                 <w:rStyle w:val="Hyperlink"/>
@@ -2289,7 +2286,7 @@
               <w:rPr>
                 <w:noProof/>
               </w:rPr>
-              <w:instrText xml:space="preserve"> PAGEREF _Toc243679764 \h </w:instrText>
+              <w:instrText xml:space="preserve"> PAGEREF _Toc243680533 \h </w:instrText>
             </w:r>
             <w:r>
               <w:rPr>
@@ -2330,7 +2327,7 @@
               <w:szCs w:val="22"/>
             </w:rPr>
           </w:pPr>
-          <w:hyperlink w:anchor="_Toc243679765" w:history="1">
+          <w:hyperlink w:anchor="_Toc243680534" w:history="1">
             <w:r>
               <w:rPr>
                 <w:rStyle w:val="Hyperlink"/>
@@ -2354,7 +2351,7 @@
               <w:rPr>
                 <w:noProof/>
               </w:rPr>
-              <w:instrText xml:space="preserve"> PAGEREF _Toc243679765 \h </w:instrText>
+              <w:instrText xml:space="preserve"> PAGEREF _Toc243680534 \h </w:instrText>
             </w:r>
             <w:r>
               <w:rPr>
@@ -2395,7 +2392,7 @@
               <w:szCs w:val="22"/>
             </w:rPr>
           </w:pPr>
-          <w:hyperlink w:anchor="_Toc243679766" w:history="1">
+          <w:hyperlink w:anchor="_Toc243680535" w:history="1">
             <w:r>
               <w:rPr>
                 <w:rStyle w:val="Hyperlink"/>
@@ -2419,7 +2416,7 @@
               <w:rPr>
                 <w:noProof/>
               </w:rPr>
-              <w:instrText xml:space="preserve"> PAGEREF _Toc243679766 \h </w:instrText>
+              <w:instrText xml:space="preserve"> PAGEREF _Toc243680535 \h </w:instrText>
             </w:r>
             <w:r>
               <w:rPr>
@@ -2460,7 +2457,7 @@
               <w:szCs w:val="22"/>
             </w:rPr>
           </w:pPr>
-          <w:hyperlink w:anchor="_Toc243679767" w:history="1">
+          <w:hyperlink w:anchor="_Toc243680536" w:history="1">
             <w:r>
               <w:rPr>
                 <w:rStyle w:val="Hyperlink"/>
@@ -2484,7 +2481,7 @@
               <w:rPr>
                 <w:noProof/>
               </w:rPr>
-              <w:instrText xml:space="preserve"> PAGEREF _Toc243679767 \h </w:instrText>
+              <w:instrText xml:space="preserve"> PAGEREF _Toc243680536 \h </w:instrText>
             </w:r>
             <w:r>
               <w:rPr>
@@ -2525,7 +2522,7 @@
               <w:szCs w:val="22"/>
             </w:rPr>
           </w:pPr>
-          <w:hyperlink w:anchor="_Toc243679768" w:history="1">
+          <w:hyperlink w:anchor="_Toc243680537" w:history="1">
             <w:r>
               <w:rPr>
                 <w:rStyle w:val="Hyperlink"/>
@@ -2549,7 +2546,7 @@
               <w:rPr>
                 <w:noProof/>
               </w:rPr>
-              <w:instrText xml:space="preserve"> PAGEREF _Toc243679768 \h </w:instrText>
+              <w:instrText xml:space="preserve"> PAGEREF _Toc243680537 \h </w:instrText>
             </w:r>
             <w:r>
               <w:rPr>
@@ -2566,7 +2563,7 @@
               <w:rPr>
                 <w:noProof/>
               </w:rPr>
-              <w:t>15</w:t>
+              <w:t>16</w:t>
             </w:r>
             <w:r>
               <w:rPr>
@@ -2590,7 +2587,7 @@
               <w:szCs w:val="22"/>
             </w:rPr>
           </w:pPr>
-          <w:hyperlink w:anchor="_Toc243679769" w:history="1">
+          <w:hyperlink w:anchor="_Toc243680538" w:history="1">
             <w:r>
               <w:rPr>
                 <w:rStyle w:val="Hyperlink"/>
@@ -2614,7 +2611,7 @@
               <w:rPr>
                 <w:noProof/>
               </w:rPr>
-              <w:instrText xml:space="preserve"> PAGEREF _Toc243679769 \h </w:instrText>
+              <w:instrText xml:space="preserve"> PAGEREF _Toc243680538 \h </w:instrText>
             </w:r>
             <w:r>
               <w:rPr>
@@ -2631,7 +2628,7 @@
               <w:rPr>
                 <w:noProof/>
               </w:rPr>
-              <w:t>15</w:t>
+              <w:t>16</w:t>
             </w:r>
             <w:r>
               <w:rPr>
@@ -2655,7 +2652,7 @@
               <w:szCs w:val="22"/>
             </w:rPr>
           </w:pPr>
-          <w:hyperlink w:anchor="_Toc243679770" w:history="1">
+          <w:hyperlink w:anchor="_Toc243680539" w:history="1">
             <w:r>
               <w:rPr>
                 <w:rStyle w:val="Hyperlink"/>
@@ -2679,7 +2676,7 @@
               <w:rPr>
                 <w:noProof/>
               </w:rPr>
-              <w:instrText xml:space="preserve"> PAGEREF _Toc243679770 \h </w:instrText>
+              <w:instrText xml:space="preserve"> PAGEREF _Toc243680539 \h </w:instrText>
             </w:r>
             <w:r>
               <w:rPr>
@@ -2696,7 +2693,7 @@
               <w:rPr>
                 <w:noProof/>
               </w:rPr>
-              <w:t>16</w:t>
+              <w:t>17</w:t>
             </w:r>
             <w:r>
               <w:rPr>
@@ -2720,7 +2717,7 @@
               <w:szCs w:val="22"/>
             </w:rPr>
           </w:pPr>
-          <w:hyperlink w:anchor="_Toc243679771" w:history="1">
+          <w:hyperlink w:anchor="_Toc243680540" w:history="1">
             <w:r>
               <w:rPr>
                 <w:rStyle w:val="Hyperlink"/>
@@ -2744,7 +2741,7 @@
               <w:rPr>
                 <w:noProof/>
               </w:rPr>
-              <w:instrText xml:space="preserve"> PAGEREF _Toc243679771 \h </w:instrText>
+              <w:instrText xml:space="preserve"> PAGEREF _Toc243680540 \h </w:instrText>
             </w:r>
             <w:r>
               <w:rPr>
@@ -2785,7 +2782,7 @@
               <w:szCs w:val="22"/>
             </w:rPr>
           </w:pPr>
-          <w:hyperlink w:anchor="_Toc243679772" w:history="1">
+          <w:hyperlink w:anchor="_Toc243680541" w:history="1">
             <w:r>
               <w:rPr>
                 <w:rStyle w:val="Hyperlink"/>
@@ -2809,7 +2806,7 @@
               <w:rPr>
                 <w:noProof/>
               </w:rPr>
-              <w:instrText xml:space="preserve"> PAGEREF _Toc243679772 \h </w:instrText>
+              <w:instrText xml:space="preserve"> PAGEREF _Toc243680541 \h </w:instrText>
             </w:r>
             <w:r>
               <w:rPr>
@@ -2850,7 +2847,7 @@
               <w:szCs w:val="22"/>
             </w:rPr>
           </w:pPr>
-          <w:hyperlink w:anchor="_Toc243679773" w:history="1">
+          <w:hyperlink w:anchor="_Toc243680542" w:history="1">
             <w:r>
               <w:rPr>
                 <w:rStyle w:val="Hyperlink"/>
@@ -2874,7 +2871,7 @@
               <w:rPr>
                 <w:noProof/>
               </w:rPr>
-              <w:instrText xml:space="preserve"> PAGEREF _Toc243679773 \h </w:instrText>
+              <w:instrText xml:space="preserve"> PAGEREF _Toc243680542 \h </w:instrText>
             </w:r>
             <w:r>
               <w:rPr>
@@ -2915,7 +2912,7 @@
               <w:szCs w:val="22"/>
             </w:rPr>
           </w:pPr>
-          <w:hyperlink w:anchor="_Toc243679774" w:history="1">
+          <w:hyperlink w:anchor="_Toc243680543" w:history="1">
             <w:r>
               <w:rPr>
                 <w:rStyle w:val="Hyperlink"/>
@@ -2939,7 +2936,7 @@
               <w:rPr>
                 <w:noProof/>
               </w:rPr>
-              <w:instrText xml:space="preserve"> PAGEREF _Toc243679774 \h </w:instrText>
+              <w:instrText xml:space="preserve"> PAGEREF _Toc243680543 \h </w:instrText>
             </w:r>
             <w:r>
               <w:rPr>
@@ -2980,7 +2977,7 @@
               <w:szCs w:val="22"/>
             </w:rPr>
           </w:pPr>
-          <w:hyperlink w:anchor="_Toc243679775" w:history="1">
+          <w:hyperlink w:anchor="_Toc243680544" w:history="1">
             <w:r>
               <w:rPr>
                 <w:rStyle w:val="Hyperlink"/>
@@ -3004,7 +3001,7 @@
               <w:rPr>
                 <w:noProof/>
               </w:rPr>
-              <w:instrText xml:space="preserve"> PAGEREF _Toc243679775 \h </w:instrText>
+              <w:instrText xml:space="preserve"> PAGEREF _Toc243680544 \h </w:instrText>
             </w:r>
             <w:r>
               <w:rPr>
@@ -3045,7 +3042,7 @@
               <w:szCs w:val="22"/>
             </w:rPr>
           </w:pPr>
-          <w:hyperlink w:anchor="_Toc243679776" w:history="1">
+          <w:hyperlink w:anchor="_Toc243680545" w:history="1">
             <w:r>
               <w:rPr>
                 <w:rStyle w:val="Hyperlink"/>
@@ -3069,7 +3066,7 @@
               <w:rPr>
                 <w:noProof/>
               </w:rPr>
-              <w:instrText xml:space="preserve"> PAGEREF _Toc243679776 \h </w:instrText>
+              <w:instrText xml:space="preserve"> PAGEREF _Toc243680545 \h </w:instrText>
             </w:r>
             <w:r>
               <w:rPr>
@@ -3110,7 +3107,7 @@
               <w:szCs w:val="22"/>
             </w:rPr>
           </w:pPr>
-          <w:hyperlink w:anchor="_Toc243679777" w:history="1">
+          <w:hyperlink w:anchor="_Toc243680546" w:history="1">
             <w:r>
               <w:rPr>
                 <w:rStyle w:val="Hyperlink"/>
@@ -3134,7 +3131,7 @@
               <w:rPr>
                 <w:noProof/>
               </w:rPr>
-              <w:instrText xml:space="preserve"> PAGEREF _Toc243679777 \h </w:instrText>
+              <w:instrText xml:space="preserve"> PAGEREF _Toc243680546 \h </w:instrText>
             </w:r>
             <w:r>
               <w:rPr>
@@ -3175,7 +3172,7 @@
               <w:szCs w:val="22"/>
             </w:rPr>
           </w:pPr>
-          <w:hyperlink w:anchor="_Toc243679778" w:history="1">
+          <w:hyperlink w:anchor="_Toc243680547" w:history="1">
             <w:r>
               <w:rPr>
                 <w:rStyle w:val="Hyperlink"/>
@@ -3199,7 +3196,7 @@
               <w:rPr>
                 <w:noProof/>
               </w:rPr>
-              <w:instrText xml:space="preserve"> PAGEREF _Toc243679778 \h </w:instrText>
+              <w:instrText xml:space="preserve"> PAGEREF _Toc243680547 \h </w:instrText>
             </w:r>
             <w:r>
               <w:rPr>
@@ -3240,7 +3237,7 @@
               <w:szCs w:val="22"/>
             </w:rPr>
           </w:pPr>
-          <w:hyperlink w:anchor="_Toc243679779" w:history="1">
+          <w:hyperlink w:anchor="_Toc243680548" w:history="1">
             <w:r>
               <w:rPr>
                 <w:rStyle w:val="Hyperlink"/>
@@ -3264,7 +3261,7 @@
               <w:rPr>
                 <w:noProof/>
               </w:rPr>
-              <w:instrText xml:space="preserve"> PAGEREF _Toc243679779 \h </w:instrText>
+              <w:instrText xml:space="preserve"> PAGEREF _Toc243680548 \h </w:instrText>
             </w:r>
             <w:r>
               <w:rPr>
@@ -3305,7 +3302,7 @@
               <w:szCs w:val="22"/>
             </w:rPr>
           </w:pPr>
-          <w:hyperlink w:anchor="_Toc243679780" w:history="1">
+          <w:hyperlink w:anchor="_Toc243680549" w:history="1">
             <w:r>
               <w:rPr>
                 <w:rStyle w:val="Hyperlink"/>
@@ -3329,7 +3326,7 @@
               <w:rPr>
                 <w:noProof/>
               </w:rPr>
-              <w:instrText xml:space="preserve"> PAGEREF _Toc243679780 \h </w:instrText>
+              <w:instrText xml:space="preserve"> PAGEREF _Toc243680549 \h </w:instrText>
             </w:r>
             <w:r>
               <w:rPr>
@@ -3370,7 +3367,7 @@
               <w:szCs w:val="22"/>
             </w:rPr>
           </w:pPr>
-          <w:hyperlink w:anchor="_Toc243679781" w:history="1">
+          <w:hyperlink w:anchor="_Toc243680550" w:history="1">
             <w:r>
               <w:rPr>
                 <w:rStyle w:val="Hyperlink"/>
@@ -3394,7 +3391,7 @@
               <w:rPr>
                 <w:noProof/>
               </w:rPr>
-              <w:instrText xml:space="preserve"> PAGEREF _Toc243679781 \h </w:instrText>
+              <w:instrText xml:space="preserve"> PAGEREF _Toc243680550 \h </w:instrText>
             </w:r>
             <w:r>
               <w:rPr>
@@ -3437,7 +3434,7 @@
       <w:pPr>
         <w:pStyle w:val="Heading1"/>
       </w:pPr>
-      <w:bookmarkStart w:id="1" w:name="_Toc243679753"/>
+      <w:bookmarkStart w:id="1" w:name="_Toc243680522"/>
       <w:r>
         <w:lastRenderedPageBreak/>
         <w:t>1  Introduction</w:t>
@@ -3449,10 +3446,10 @@
         <w:spacing w:after="120" w:line="276" w:lineRule="auto"/>
       </w:pPr>
       <w:r>
-        <w:t>The customer website is a React single-page application. Visitors browse products, read reviews, see what is featured, chat with the assistant, and - once signed in - order and pay with M-Pesa and follow their deliveries. It talks only to the website serve</w:t>
-      </w:r>
-      <w:r>
-        <w:t xml:space="preserve">r (DWS-WEB-01) through the </w:t>
+        <w:t>The customer website is a React single-page application. Visitors browse products, read reviews, see what is featured, chat with the assistant, and - once signed in - order and pay with M-Pesa and follow their delive</w:t>
+      </w:r>
+      <w:r>
+        <w:t xml:space="preserve">ries. It talks only to the website server (DWS-WEB-01) through the </w:t>
       </w:r>
       <w:r>
         <w:rPr>
@@ -3483,7 +3480,7 @@
           <w:left w:w="10" w:type="dxa"/>
           <w:right w:w="10" w:type="dxa"/>
         </w:tblCellMar>
-        <w:tblLook w:val="0000" w:firstRow="0" w:lastRow="0" w:firstColumn="0" w:lastColumn="0" w:noHBand="0" w:noVBand="0"/>
+        <w:tblLook w:val="04A0" w:firstRow="1" w:lastRow="0" w:firstColumn="1" w:lastColumn="0" w:noHBand="0" w:noVBand="1"/>
       </w:tblPr>
       <w:tblGrid>
         <w:gridCol w:w="2551"/>
@@ -3970,7 +3967,7 @@
       <w:pPr>
         <w:pStyle w:val="Heading1"/>
       </w:pPr>
-      <w:bookmarkStart w:id="2" w:name="_Toc243679754"/>
+      <w:bookmarkStart w:id="2" w:name="_Toc243680523"/>
       <w:r>
         <w:lastRenderedPageBreak/>
         <w:t>2  Pages</w:t>
@@ -4025,7 +4022,7 @@
           <w:left w:w="10" w:type="dxa"/>
           <w:right w:w="10" w:type="dxa"/>
         </w:tblCellMar>
-        <w:tblLook w:val="0000" w:firstRow="0" w:lastRow="0" w:firstColumn="0" w:lastColumn="0" w:noHBand="0" w:noVBand="0"/>
+        <w:tblLook w:val="04A0" w:firstRow="1" w:lastRow="0" w:firstColumn="1" w:lastColumn="0" w:noHBand="0" w:noVBand="1"/>
       </w:tblPr>
       <w:tblGrid>
         <w:gridCol w:w="1880"/>
@@ -4066,7 +4063,17 @@
                 <w:sz w:val="19"/>
                 <w:szCs w:val="19"/>
               </w:rPr>
-              <w:t>Address</w:t>
+              <w:t>Addres</w:t>
+            </w:r>
+            <w:r>
+              <w:rPr>
+                <w:b/>
+                <w:bCs/>
+                <w:color w:val="FFFFFF"/>
+                <w:sz w:val="19"/>
+                <w:szCs w:val="19"/>
+              </w:rPr>
+              <w:t>s</w:t>
             </w:r>
           </w:p>
         </w:tc>
@@ -5180,7 +5187,7 @@
       <w:pPr>
         <w:pStyle w:val="Heading1"/>
       </w:pPr>
-      <w:bookmarkStart w:id="3" w:name="_Toc243679755"/>
+      <w:bookmarkStart w:id="3" w:name="_Toc243680524"/>
       <w:r>
         <w:lastRenderedPageBreak/>
         <w:t>3  Shared components and state</w:t>
@@ -5191,7 +5198,7 @@
       <w:pPr>
         <w:pStyle w:val="Heading2"/>
       </w:pPr>
-      <w:bookmarkStart w:id="4" w:name="_Toc243679756"/>
+      <w:bookmarkStart w:id="4" w:name="_Toc243680525"/>
       <w:r>
         <w:t>3.1  Components (src/components)</w:t>
       </w:r>
@@ -5213,7 +5220,7 @@
           <w:left w:w="10" w:type="dxa"/>
           <w:right w:w="10" w:type="dxa"/>
         </w:tblCellMar>
-        <w:tblLook w:val="0000" w:firstRow="0" w:lastRow="0" w:firstColumn="0" w:lastColumn="0" w:noHBand="0" w:noVBand="0"/>
+        <w:tblLook w:val="04A0" w:firstRow="1" w:lastRow="0" w:firstColumn="1" w:lastColumn="0" w:noHBand="0" w:noVBand="1"/>
       </w:tblPr>
       <w:tblGrid>
         <w:gridCol w:w="2753"/>
@@ -5400,14 +5407,7 @@
                 <w:sz w:val="19"/>
                 <w:szCs w:val="19"/>
               </w:rPr>
-              <w:t xml:space="preserve">The full-screen sign-in and sign-up screen: the form on one side </w:t>
-            </w:r>
-            <w:r>
-              <w:rPr>
-                <w:sz w:val="19"/>
-                <w:szCs w:val="19"/>
-              </w:rPr>
-              <w:t>and the About film on the other (see Signing in and signing up). Escape closes it.</w:t>
+              <w:t>The full-screen sign-in and sign-up screen: the form on one side and the About film on the other (see Signing in and signing up). Escape closes it.</w:t>
             </w:r>
           </w:p>
         </w:tc>
@@ -5466,7 +5466,14 @@
                 <w:sz w:val="19"/>
                 <w:szCs w:val="19"/>
               </w:rPr>
-              <w:t>The About film inside the sign-in screen: Acquisition to Delivery with captions, progress bars and a pause button.</w:t>
+              <w:t>The About film inside the sign-in screen: Acquisition to Delivery with captions, progress bars an</w:t>
+            </w:r>
+            <w:r>
+              <w:rPr>
+                <w:sz w:val="19"/>
+                <w:szCs w:val="19"/>
+              </w:rPr>
+              <w:t>d a pause button.</w:t>
             </w:r>
           </w:p>
         </w:tc>
@@ -5647,14 +5654,14 @@
                 <w:sz w:val="19"/>
                 <w:szCs w:val="19"/>
               </w:rPr>
-              <w:t xml:space="preserve">Asks for the optional cookie categories (analytics, marketing): Accept all, Reject </w:t>
-            </w:r>
-            <w:r>
-              <w:rPr>
-                <w:sz w:val="19"/>
-                <w:szCs w:val="19"/>
-              </w:rPr>
-              <w:t>all and Customize. Customize is a wood-coloured link (since 20 October 2026; it used to share the red of Remove and Sign out, which made a normal choice look like a warning).</w:t>
+              <w:t>Asks for the optional cookie categories (analytics, marketing): Accept all, Reject all and Customize. Customize is a wood-coloured link (since 20 October 2026; it used to share the red of Remove and Sign out, which made a normal choice look like a warning)</w:t>
+            </w:r>
+            <w:r>
+              <w:rPr>
+                <w:sz w:val="19"/>
+                <w:szCs w:val="19"/>
+              </w:rPr>
+              <w:t>.</w:t>
             </w:r>
           </w:p>
         </w:tc>
@@ -5774,14 +5781,7 @@
                 <w:sz w:val="19"/>
                 <w:szCs w:val="19"/>
               </w:rPr>
-              <w:t>Product display pie</w:t>
-            </w:r>
-            <w:r>
-              <w:rPr>
-                <w:sz w:val="19"/>
-                <w:szCs w:val="19"/>
-              </w:rPr>
-              <w:t>ces; ProductCard shows the Featured tag; ProductDescription shows the AI-arranged copy or tidies the original itself.</w:t>
+              <w:t>Product display pieces; ProductCard shows the Featured tag; ProductDescription shows the AI-arranged copy or tidies the original itself.</w:t>
             </w:r>
           </w:p>
         </w:tc>
@@ -6156,7 +6156,7 @@
       <w:pPr>
         <w:pStyle w:val="Heading2"/>
       </w:pPr>
-      <w:bookmarkStart w:id="5" w:name="_Toc243679757"/>
+      <w:bookmarkStart w:id="5" w:name="_Toc243680526"/>
       <w:r>
         <w:t>3.2  State (src/context)</w:t>
       </w:r>
@@ -6178,7 +6178,7 @@
           <w:left w:w="10" w:type="dxa"/>
           <w:right w:w="10" w:type="dxa"/>
         </w:tblCellMar>
-        <w:tblLook w:val="0000" w:firstRow="0" w:lastRow="0" w:firstColumn="0" w:lastColumn="0" w:noHBand="0" w:noVBand="0"/>
+        <w:tblLook w:val="04A0" w:firstRow="1" w:lastRow="0" w:firstColumn="1" w:lastColumn="0" w:noHBand="0" w:noVBand="1"/>
       </w:tblPr>
       <w:tblGrid>
         <w:gridCol w:w="2409"/>
@@ -6975,7 +6975,7 @@
       <w:pPr>
         <w:pStyle w:val="Heading2"/>
       </w:pPr>
-      <w:bookmarkStart w:id="6" w:name="_Toc243679758"/>
+      <w:bookmarkStart w:id="6" w:name="_Toc243680527"/>
       <w:r>
         <w:t>3.3  Helpers (src/core and src/api)</w:t>
       </w:r>
@@ -7249,7 +7249,7 @@
       <w:pPr>
         <w:pStyle w:val="Heading1"/>
       </w:pPr>
-      <w:bookmarkStart w:id="7" w:name="_Toc243679759"/>
+      <w:bookmarkStart w:id="7" w:name="_Toc243680528"/>
       <w:r>
         <w:lastRenderedPageBreak/>
         <w:t>4  Feature notes</w:t>
@@ -7260,7 +7260,7 @@
       <w:pPr>
         <w:pStyle w:val="Heading2"/>
       </w:pPr>
-      <w:bookmarkStart w:id="8" w:name="_Toc243679760"/>
+      <w:bookmarkStart w:id="8" w:name="_Toc243680529"/>
       <w:r>
         <w:t>4.1  Buying and paying</w:t>
       </w:r>
@@ -7340,7 +7340,7 @@
       <w:pPr>
         <w:pStyle w:val="Heading2"/>
       </w:pPr>
-      <w:bookmarkStart w:id="9" w:name="_Toc243679761"/>
+      <w:bookmarkStart w:id="9" w:name="_Toc243680530"/>
       <w:r>
         <w:t>4.2  Featured campaigns</w:t>
       </w:r>
@@ -7376,7 +7376,7 @@
           <w:left w:w="10" w:type="dxa"/>
           <w:right w:w="10" w:type="dxa"/>
         </w:tblCellMar>
-        <w:tblLook w:val="0000" w:firstRow="0" w:lastRow="0" w:firstColumn="0" w:lastColumn="0" w:noHBand="0" w:noVBand="0"/>
+        <w:tblLook w:val="04A0" w:firstRow="1" w:lastRow="0" w:firstColumn="1" w:lastColumn="0" w:noHBand="0" w:noVBand="1"/>
       </w:tblPr>
       <w:tblGrid>
         <w:gridCol w:w="2753"/>
@@ -7599,16 +7599,7 @@
                 <w:sz w:val="19"/>
                 <w:szCs w:val="19"/>
               </w:rPr>
-              <w:t>Produ</w:t>
-            </w:r>
-            <w:r>
-              <w:rPr>
-                <w:b/>
-                <w:bCs/>
-                <w:sz w:val="19"/>
-                <w:szCs w:val="19"/>
-              </w:rPr>
-              <w:t>ct page</w:t>
+              <w:t>Product page</w:t>
             </w:r>
           </w:p>
         </w:tc>
@@ -7707,7 +7698,7 @@
       <w:pPr>
         <w:pStyle w:val="Heading2"/>
       </w:pPr>
-      <w:bookmarkStart w:id="10" w:name="_Toc243679762"/>
+      <w:bookmarkStart w:id="10" w:name="_Toc243680531"/>
       <w:r>
         <w:t>4.3  Product page</w:t>
       </w:r>
@@ -7874,7 +7865,7 @@
       <w:pPr>
         <w:pStyle w:val="Heading2"/>
       </w:pPr>
-      <w:bookmarkStart w:id="11" w:name="_Toc243679763"/>
+      <w:bookmarkStart w:id="11" w:name="_Toc243680532"/>
       <w:r>
         <w:t>4.4  Ratings</w:t>
       </w:r>
@@ -7955,7 +7946,7 @@
       <w:pPr>
         <w:pStyle w:val="Heading2"/>
       </w:pPr>
-      <w:bookmarkStart w:id="12" w:name="_Toc243679764"/>
+      <w:bookmarkStart w:id="12" w:name="_Toc243680533"/>
       <w:r>
         <w:t>4.5  Signing in and signing up</w:t>
       </w:r>
@@ -7966,16 +7957,13 @@
         <w:spacing w:after="120" w:line="276" w:lineRule="auto"/>
       </w:pPr>
       <w:r>
-        <w:t>Signing in opens a full-</w:t>
-      </w:r>
-      <w:r>
-        <w:t>screen window: the form on the left and, on the right, the About film (Acquisition, Harvest, Value addition, Packaging and Delivery) with captions, progress bars and a pause button. On a computer the film plays every third large frame of the About animatio</w:t>
-      </w:r>
-      <w:r>
-        <w:t>n with blended in-between frames, about 5.6 seconds per chapter. Phones, data-saver connections and devices with animations switched off get one still picture per chapter that cross-fades instead, and on a phone the film is a strip above the form. Escape o</w:t>
-      </w:r>
-      <w:r>
-        <w:t>r the close button leaves; the page behind stays where it was.</w:t>
+        <w:t>Signing in opens a full-screen window: the form on the left and, on the right, the About film (Acquisition, Harvest, Value addition, Packaging and Delivery) with captions, progress bars and a pause button. On a computer the film plays every third large fra</w:t>
+      </w:r>
+      <w:r>
+        <w:t xml:space="preserve">me of the About animation with blended in-between frames, about 5.6 seconds per chapter. Phones, data-saver connections and devices with animations switched off get one still picture per chapter that cross-fades instead, and on a phone the film is a strip </w:t>
+      </w:r>
+      <w:r>
+        <w:t>above the form. Escape or the close button leaves; the page behind stays where it was.</w:t>
       </w:r>
     </w:p>
     <w:tbl>
@@ -7994,7 +7982,7 @@
           <w:left w:w="10" w:type="dxa"/>
           <w:right w:w="10" w:type="dxa"/>
         </w:tblCellMar>
-        <w:tblLook w:val="0000" w:firstRow="0" w:lastRow="0" w:firstColumn="0" w:lastColumn="0" w:noHBand="0" w:noVBand="0"/>
+        <w:tblLook w:val="04A0" w:firstRow="1" w:lastRow="0" w:firstColumn="1" w:lastColumn="0" w:noHBand="0" w:noVBand="1"/>
       </w:tblPr>
       <w:tblGrid>
         <w:gridCol w:w="2478"/>
@@ -8240,14 +8228,14 @@
                 <w:sz w:val="19"/>
                 <w:szCs w:val="19"/>
               </w:rPr>
-              <w:t>A suggestion for common misspellings appears while typing ("Did you mean ...@gmail.com?"), and the format is checked when the field is left. The backend then checks it again: the format, that the domain can receive email, and that no other</w:t>
-            </w:r>
-            <w:r>
-              <w:rPr>
-                <w:sz w:val="19"/>
-                <w:szCs w:val="19"/>
-              </w:rPr>
-              <w:t xml:space="preserve"> account already uses it. Addresses with a "+tag" (name+shop@gmail.com) are accepted.</w:t>
+              <w:t xml:space="preserve">A suggestion for common misspellings appears while typing ("Did you mean ...@gmail.com?"), and the format is checked when the field is left. The backend then checks it again: the format, that the domain can receive email, and that no other account already </w:t>
+            </w:r>
+            <w:r>
+              <w:rPr>
+                <w:sz w:val="19"/>
+                <w:szCs w:val="19"/>
+              </w:rPr>
+              <w:t>uses it. Addresses with a "+tag" (name+shop@gmail.com) are accepted.</w:t>
             </w:r>
           </w:p>
         </w:tc>
@@ -8308,14 +8296,14 @@
                 <w:sz w:val="19"/>
                 <w:szCs w:val="19"/>
               </w:rPr>
-              <w:t>Shown above the form. A new Google user then chooses a username (same rule) and gives a phone number before the account is created. A Google account</w:t>
-            </w:r>
-            <w:r>
-              <w:rPr>
-                <w:sz w:val="19"/>
-                <w:szCs w:val="19"/>
-              </w:rPr>
-              <w:t xml:space="preserve"> whose email already belongs to an account here is not joined to it; the person is asked to sign in with that account instead.</w:t>
+              <w:t>Shown above the form. A new Google user then chooses a username (same rule) and gives a phone number before the account is created. A Google account whose email alre</w:t>
+            </w:r>
+            <w:r>
+              <w:rPr>
+                <w:sz w:val="19"/>
+                <w:szCs w:val="19"/>
+              </w:rPr>
+              <w:t>ady belongs to an account here is not joined to it; the person is asked to sign in with that account instead.</w:t>
             </w:r>
           </w:p>
         </w:tc>
@@ -8492,9 +8480,12 @@
       <w:pPr>
         <w:pStyle w:val="Heading2"/>
       </w:pPr>
-      <w:bookmarkStart w:id="13" w:name="_Toc243679765"/>
-      <w:r>
-        <w:t>4.6  Confirming the phone number (SMS code)</w:t>
+      <w:bookmarkStart w:id="13" w:name="_Toc243680534"/>
+      <w:r>
+        <w:t xml:space="preserve">4.6  </w:t>
+      </w:r>
+      <w:r>
+        <w:t>Confirming the phone number (SMS code)</w:t>
       </w:r>
       <w:bookmarkEnd w:id="13"/>
     </w:p>
@@ -8503,13 +8494,13 @@
         <w:spacing w:after="120" w:line="276" w:lineRule="auto"/>
       </w:pPr>
       <w:r>
-        <w:t>"one may give a phone number not theirs ... push a code to the phone number they placed so that its verified ... so when prefilling it during payment is not wrong" - since 17 October 2026 a phone number counts as</w:t>
-      </w:r>
-      <w:r>
-        <w:t xml:space="preserve"> the customer's once they type the 6-digit code texted to it. For now this is for Airtel numbers only: Africa's Talking's shared sender reaches only Airtel, and Dateroem's own sender name (needed for Safaricom) is still to come. Other numbers are taken as </w:t>
-      </w:r>
-      <w:r>
-        <w:t>typed, as before, and the sign-up form says which numbers get a code.</w:t>
+        <w:t xml:space="preserve">"one may give a phone number not theirs ... push a code to the phone number they placed so that its verified ... so when prefilling it during payment is not wrong" - since 17 October 2026 a phone number counts as the </w:t>
+      </w:r>
+      <w:r>
+        <w:t>customer's once they type the 6-digit code texted to it. For now this is for Airtel numbers only: Africa's Talking's shared sender reaches only Airtel, and Dateroem's own sender name (needed for Safaricom) is still to come. Other numbers are taken as typed</w:t>
+      </w:r>
+      <w:r>
+        <w:t>, as before, and the sign-up form says which numbers get a code.</w:t>
       </w:r>
     </w:p>
     <w:p>
@@ -8522,10 +8513,10 @@
         <w:spacing w:after="60" w:line="264" w:lineRule="auto"/>
       </w:pPr>
       <w:r>
-        <w:t xml:space="preserve">Sign-up (password or Google): after Create account, a "Confirm your phone number" step - "We sent a 6-digit code by SMS to 07XX XXX 123". Typing (or pasting) the six digits checks it at </w:t>
-      </w:r>
-      <w:r>
-        <w:t>once; the account is created only after the right code. Send a new code (after a minute) and Change number are under the box.</w:t>
+        <w:t>Sign-up (password or Google): after Create account, a "Confirm your phone number" step - "We sent a 6-digit code by SMS to 07XX XXX 123". Typing (or pasting) the six digits checks it at once;</w:t>
+      </w:r>
+      <w:r>
+        <w:t xml:space="preserve"> the account is created only after the right code. Send a new code (after a minute) and Change number are under the box.</w:t>
       </w:r>
     </w:p>
     <w:p>
@@ -8538,10 +8529,10 @@
         <w:spacing w:after="60" w:line="264" w:lineRule="auto"/>
       </w:pPr>
       <w:r>
-        <w:t>A sign-up that fails for another reason (a username already taken) keeps the confirmed number for 30 minutes, so no second code is</w:t>
-      </w:r>
-      <w:r>
-        <w:t xml:space="preserve"> needed.</w:t>
+        <w:t>A sign-up that fails for another reason (a username already taken) keeps the confirmed number for 30 minutes, so no second code is need</w:t>
+      </w:r>
+      <w:r>
+        <w:t>ed.</w:t>
       </w:r>
     </w:p>
     <w:p>
@@ -8554,10 +8545,10 @@
         <w:spacing w:after="60" w:line="264" w:lineRule="auto"/>
       </w:pPr>
       <w:r>
-        <w:t>Accounts made before (or whose number an admin changed): the cart says "Before your first order we'll text a code to confirm the phone number on your account", and Place order opens a "Confirm your phone number" window with the account's number, w</w:t>
-      </w:r>
-      <w:r>
-        <w:t>hich can be changed. After the right code the order carries on.</w:t>
+        <w:t xml:space="preserve">Accounts made before (or whose number an admin changed): the cart says "Before your first order we'll text a code to confirm the phone number on your account", and Place order opens a "Confirm your phone number" window with the account's number, which </w:t>
+      </w:r>
+      <w:r>
+        <w:t>can be changed. After the right code the order carries on.</w:t>
       </w:r>
     </w:p>
     <w:p>
@@ -8641,17 +8632,7 @@
           <w:sz w:val="18"/>
           <w:szCs w:val="18"/>
         </w:rPr>
-        <w:t>Figure 2: Sign-up</w:t>
-      </w:r>
-      <w:r>
-        <w:rPr>
-          <w:i/>
-          <w:iCs/>
-          <w:color w:val="5F6B66"/>
-          <w:sz w:val="18"/>
-          <w:szCs w:val="18"/>
-        </w:rPr>
-        <w:t>: the code step (sample account)</w:t>
+        <w:t>Figure 2: Sign-up: the code step (sample account)</w:t>
       </w:r>
     </w:p>
     <w:p>
@@ -8787,17 +8768,14 @@
         <w:t>src/api/client.js</w:t>
       </w:r>
       <w:r>
-        <w:t xml:space="preserve"> (sendPhoneCode, </w:t>
-      </w:r>
-      <w:r>
-        <w:t>verifyPhoneCode). Which networks get codes, the limits and the SMS wording are backend settings and code (see the Backend Server document).</w:t>
+        <w:t xml:space="preserve"> (sendPhoneCode, verifyPhoneCode). Which networks get codes, the limits and the SMS wording are backend settings and code (see the Backend Server document).</w:t>
       </w:r>
     </w:p>
     <w:p>
       <w:pPr>
         <w:pStyle w:val="Heading2"/>
       </w:pPr>
-      <w:bookmarkStart w:id="14" w:name="_Toc243679766"/>
+      <w:bookmarkStart w:id="14" w:name="_Toc243680535"/>
       <w:r>
         <w:t>4.7  Order tickets and Track my order</w:t>
       </w:r>
@@ -8808,13 +8786,13 @@
         <w:spacing w:after="120" w:line="276" w:lineRule="auto"/>
       </w:pPr>
       <w:r>
-        <w:t>Since 23 October 2026 every order has a ticket like DW-7K3Q9P (migration 038):</w:t>
-      </w:r>
-      <w:r>
-        <w:t xml:space="preserve"> six letters and digits drawn at random, without the easily confused 0, O, 1, I and L, so it says nothing about how many orders exist and the next one can't be guessed. The customer sees it while M-Pesa confirms the payment, on the order page and on each o</w:t>
-      </w:r>
-      <w:r>
-        <w:t>rder in Ordered Goods, and quotes it to the team; the assistant names orders by it too.</w:t>
+        <w:t>Since 23 October 2026 every order has a ticket like DW-7K3Q9P</w:t>
+      </w:r>
+      <w:r>
+        <w:t xml:space="preserve"> (migration 038): six letters and digits drawn at random, without the easily confused 0, O, 1, I and L, so it says nothing about how many orders exist and the next one can't be guessed. The customer sees it while M-Pesa confirms the payment, on the order p</w:t>
+      </w:r>
+      <w:r>
+        <w:t>age and on each order in Ordered Goods, and quotes it to the team; the assistant names orders by it too.</w:t>
       </w:r>
     </w:p>
     <w:p>
@@ -8846,16 +8824,16 @@
         <w:t>pages/TrackOrderPage.jsx</w:t>
       </w:r>
       <w:r>
-        <w:t>) needs no sign-in: the ticket and the last 3 digits of the phone number on the account. It shows the order in four step</w:t>
-      </w:r>
-      <w:r>
-        <w:t>s - placed, paid, on a delivery, delivered (or cancelled, or being rescheduled) - with the dates, the pickup area, the total and the items, never the customer's name or phone. Signed-out visitors find it in the top links where signed-in customers see Order</w:t>
-      </w:r>
-      <w:r>
-        <w:t>ed Goods, and in the footer; the order page links to it with the ticket filled in. Only website orders can be tracked this way - orders staff open on a trip have no customer phone on record. Five wrong tries lock a ticket for half an hour and the page answ</w:t>
-      </w:r>
-      <w:r>
-        <w:t>ers at most 60 look-ups a minute (the backend keeps count).</w:t>
+        <w:t>) needs no sign-in: the ticket and the last 3 digits of the phone number on the account. It shows the o</w:t>
+      </w:r>
+      <w:r>
+        <w:t>rder in four steps - placed, paid, on a delivery, delivered (or cancelled, or being rescheduled) - with the dates, the pickup area, the total and the items, never the customer's name or phone. Signed-out visitors find it in the top links where signed-in cu</w:t>
+      </w:r>
+      <w:r>
+        <w:t xml:space="preserve">stomers see Ordered Goods, and in the footer; the order page links to it with the ticket filled in. Only website orders can be tracked this way - orders staff open on a trip have no customer phone on record. Five wrong tries lock a ticket for half an hour </w:t>
+      </w:r>
+      <w:r>
+        <w:t>and the page answers at most 60 look-ups a minute (the backend keeps count).</w:t>
       </w:r>
     </w:p>
     <w:p>
@@ -8952,7 +8930,7 @@
       <w:pPr>
         <w:pStyle w:val="Heading2"/>
       </w:pPr>
-      <w:bookmarkStart w:id="15" w:name="_Toc243679767"/>
+      <w:bookmarkStart w:id="15" w:name="_Toc243680536"/>
       <w:r>
         <w:t>4.8  About page story</w:t>
       </w:r>
@@ -8963,10 +8941,13 @@
         <w:spacing w:after="120" w:line="276" w:lineRule="auto"/>
       </w:pPr>
       <w:r>
-        <w:t>The About page plays a film of the business as the visitor scrolls: Acquisition, Harvest, Value addition, Packaging and Delivery, each with a card that flies in. Scrolling moves one stage at a time with smooth glides, and the dots allow jumping to a stage.</w:t>
-      </w:r>
-      <w:r>
-        <w:t xml:space="preserve"> Frames are drawn on a canvas that stays pinned while the section scrolls. The same frames play in the sign-in screen.</w:t>
+        <w:t>The About page plays a film of the business as the visitor scrolls: Acquisition, Harvest, Value addit</w:t>
+      </w:r>
+      <w:r>
+        <w:t>ion, Packaging and Delivery, each with a card that flies in. Scrolling moves one stage at a time with smooth glides, and the dots allow jumping to a stage. Frames are drawn on a canvas that stays pinned while the section scrolls. The same frames play in th</w:t>
+      </w:r>
+      <w:r>
+        <w:t>e sign-in screen.</w:t>
       </w:r>
     </w:p>
     <w:tbl>
@@ -8985,7 +8966,7 @@
           <w:left w:w="10" w:type="dxa"/>
           <w:right w:w="10" w:type="dxa"/>
         </w:tblCellMar>
-        <w:tblLook w:val="0000" w:firstRow="0" w:lastRow="0" w:firstColumn="0" w:lastColumn="0" w:noHBand="0" w:noVBand="0"/>
+        <w:tblLook w:val="04A0" w:firstRow="1" w:lastRow="0" w:firstColumn="1" w:lastColumn="0" w:noHBand="0" w:noVBand="1"/>
       </w:tblPr>
       <w:tblGrid>
         <w:gridCol w:w="3125"/>
@@ -9299,16 +9280,7 @@
                 <w:sz w:val="17"/>
                 <w:szCs w:val="17"/>
               </w:rPr>
-              <w:t>src/components/</w:t>
-            </w:r>
-            <w:r>
-              <w:rPr>
-                <w:rFonts w:ascii="Consolas" w:eastAsia="Consolas" w:hAnsi="Consolas" w:cs="Consolas"/>
-                <w:color w:val="3B3F3D"/>
-                <w:sz w:val="17"/>
-                <w:szCs w:val="17"/>
-              </w:rPr>
-              <w:t>AuthStory.jsx</w:t>
+              <w:t>src/components/AuthStory.jsx</w:t>
             </w:r>
             <w:r>
               <w:rPr>
@@ -9352,13 +9324,26 @@
         <w:spacing w:after="120" w:line="276" w:lineRule="auto"/>
       </w:pPr>
       <w:r>
-        <w:t>Below the film (since 23 October 2026) the page sets out the company for customers and for payment-provider checks: Who we are, with the registered facts (business name, business registration number, the workshop in Nakuru and where the timber comes from -</w:t>
-      </w:r>
-      <w:r>
-        <w:t xml:space="preserve"> farms across Central Kenya); How we work in four numbered steps (sourcing, milling and finishing, ordering and paying, delivery); the mission and vision; What we stand for; Where to find us, with the workshop address and an Open in Google Maps button; and</w:t>
-      </w:r>
-      <w:r>
-        <w:t xml:space="preserve"> the founder, with a round photo frame. The KRA PIN and personal phone numbers are deliberately left off the public page.</w:t>
+        <w:t xml:space="preserve">Below the film (since 23 October 2026) </w:t>
+      </w:r>
+      <w:r>
+        <w:t>the page sets out the company for customers and for payment-provider checks: Who we are, with the registered facts (business name, business registration number, the workshop in Nakuru and where the timber comes from - farms across Central Kenya); How we wo</w:t>
+      </w:r>
+      <w:r>
+        <w:t xml:space="preserve">rk in four numbered steps (sourcing, milling and finishing, ordering and paying, delivery); Our purpose (the mission and vision) beside a What we stand for card; Where to find us, with the workshop address, an Open in Google Maps button on the owner's own </w:t>
+      </w:r>
+      <w:r>
+        <w:t xml:space="preserve">pin and a Reach us card with the company phone, WhatsApp, email and socials (from the website </w:t>
+      </w:r>
+      <w:r>
+        <w:lastRenderedPageBreak/>
+        <w:t>server's settings); and the founder, with a round photo frame. The same day it was laid out again for big screens ("the rest need to be ordered good"): one centre</w:t>
+      </w:r>
+      <w:r>
+        <w:t>d column, every section with the words on the left and the facts in a card on the right, and the four steps on one line joined by a wood line (two by two on tablets, down a line on phones). The KRA PIN and personal phone numbers are deliberately left off t</w:t>
+      </w:r>
+      <w:r>
+        <w:t>he public page.</w:t>
       </w:r>
     </w:p>
     <w:tbl>
@@ -9377,7 +9362,7 @@
           <w:left w:w="10" w:type="dxa"/>
           <w:right w:w="10" w:type="dxa"/>
         </w:tblCellMar>
-        <w:tblLook w:val="0000" w:firstRow="0" w:lastRow="0" w:firstColumn="0" w:lastColumn="0" w:noHBand="0" w:noVBand="0"/>
+        <w:tblLook w:val="04A0" w:firstRow="1" w:lastRow="0" w:firstColumn="1" w:lastColumn="0" w:noHBand="0" w:noVBand="1"/>
       </w:tblPr>
       <w:tblGrid>
         <w:gridCol w:w="3125"/>
@@ -9417,7 +9402,6 @@
                 <w:sz w:val="19"/>
                 <w:szCs w:val="19"/>
               </w:rPr>
-              <w:lastRenderedPageBreak/>
               <w:t>To change</w:t>
             </w:r>
           </w:p>
@@ -9606,14 +9590,7 @@
                 <w:sz w:val="19"/>
                 <w:szCs w:val="19"/>
               </w:rPr>
-              <w:t xml:space="preserve"> </w:t>
-            </w:r>
-            <w:r>
-              <w:rPr>
-                <w:sz w:val="19"/>
-                <w:szCs w:val="19"/>
-              </w:rPr>
-              <w:t xml:space="preserve">in </w:t>
+              <w:t xml:space="preserve"> in </w:t>
             </w:r>
             <w:r>
               <w:rPr>
@@ -9720,7 +9697,7 @@
         </w:rPr>
         <w:drawing>
           <wp:inline distT="0" distB="0" distL="0" distR="0">
-            <wp:extent cx="6096000" cy="4448175"/>
+            <wp:extent cx="6096000" cy="6181725"/>
             <wp:effectExtent l="0" t="0" r="0" b="0"/>
             <wp:docPr id="5" name="Picture 5"/>
             <wp:cNvGraphicFramePr>
@@ -9745,7 +9722,7 @@
                   <pic:spPr bwMode="auto">
                     <a:xfrm>
                       <a:off x="0" y="0"/>
-                      <a:ext cx="6096000" cy="4448175"/>
+                      <a:ext cx="6096000" cy="6181725"/>
                     </a:xfrm>
                     <a:prstGeom prst="rect">
                       <a:avLst/>
@@ -9771,15 +9748,16 @@
           <w:sz w:val="18"/>
           <w:szCs w:val="18"/>
         </w:rPr>
-        <w:t>Figure 5: The About page: How we work, mission and vision, What we stand for, Where to find us</w:t>
+        <w:t>Figure 5: The About page: How we work, Our purpose with What we stand for, Where to find us with the Reach us card</w:t>
       </w:r>
     </w:p>
     <w:p>
       <w:pPr>
         <w:pStyle w:val="Heading2"/>
       </w:pPr>
-      <w:bookmarkStart w:id="16" w:name="_Toc243679768"/>
-      <w:r>
+      <w:bookmarkStart w:id="16" w:name="_Toc243680537"/>
+      <w:r>
+        <w:lastRenderedPageBreak/>
         <w:t>4.9  Help page and support email</w:t>
       </w:r>
       <w:bookmarkEnd w:id="16"/>
@@ -9789,20 +9767,23 @@
         <w:spacing w:after="120" w:line="276" w:lineRule="auto"/>
       </w:pPr>
       <w:r>
-        <w:t xml:space="preserve">The Help page's contact buttons sit right under the chat button, before the questions (since 7 October 2026; they used to be at </w:t>
-      </w:r>
-      <w:r>
-        <w:t>the bottom of the page). The email button opens the Send us an email window (below); the address is shown under the buttons: dateroemwoodsales+support@gmail.com. That is the business Gmail (dateroemwoodsales@gmail.com) with a "+support" tag, so the mail ar</w:t>
-      </w:r>
-      <w:r>
-        <w:t>rives in the business mailbox and a Gmail filter files it under the Customers label. The page, the assistant and the fallback helper all read the contacts from the website server's settings (DWS-WEB-01).</w:t>
+        <w:t>The Help page's con</w:t>
+      </w:r>
+      <w:r>
+        <w:t>tact buttons sit right under the chat button, before the questions (since 7 October 2026; they used to be at the bottom of the page). The email button opens the Send us an email window (below); the address is shown under the buttons: dateroemwoodsales+supp</w:t>
+      </w:r>
+      <w:r>
+        <w:t>ort@gmail.com. That is the business Gmail (dateroemwoodsales@gmail.com) with a "+support" tag, so the mail arrives in the business mailbox and a Gmail filter files it under the Customers label. The page, the assistant and the fallback helper all read the c</w:t>
+      </w:r>
+      <w:r>
+        <w:t>ontacts from the website server's settings (DWS-WEB-01).</w:t>
       </w:r>
     </w:p>
     <w:p>
       <w:pPr>
         <w:pStyle w:val="Heading2"/>
       </w:pPr>
-      <w:bookmarkStart w:id="17" w:name="_Toc243679769"/>
+      <w:bookmarkStart w:id="17" w:name="_Toc243680538"/>
       <w:r>
         <w:t>4.10  Frequently asked questions</w:t>
       </w:r>
@@ -9813,10 +9794,7 @@
         <w:spacing w:after="120" w:line="276" w:lineRule="auto"/>
       </w:pPr>
       <w:r>
-        <w:t>Since 7 October 202</w:t>
-      </w:r>
-      <w:r>
-        <w:t>6 the Help page lists frequently asked questions below the chat button and the contact buttons (</w:t>
+        <w:t>Since 7 October 2026 the Help page lists frequently asked questions below the chat button and the contact buttons (</w:t>
       </w:r>
       <w:r>
         <w:rPr>
@@ -9840,7 +9818,10 @@
         <w:t>src/pages/HelpPage.jsx</w:t>
       </w:r>
       <w:r>
-        <w:t>). They come from the website server (</w:t>
+        <w:t>). They come fr</w:t>
+      </w:r>
+      <w:r>
+        <w:t>om the website server (</w:t>
       </w:r>
       <w:r>
         <w:rPr>
@@ -9852,10 +9833,7 @@
         <w:t>GET /help/faqs</w:t>
       </w:r>
       <w:r>
-        <w:t xml:space="preserve">), grouped by topic in the order admins set, and admins keep them up to </w:t>
-      </w:r>
-      <w:r>
-        <w:t>date in the desktop app (FAQs) - so a changed feature only needs its answer changed there, not the code.</w:t>
+        <w:t>), grouped by topic in the order admins set, and admins keep them up to date in the desktop app (FAQs) - so a changed feature only needs its answer changed there, not the code.</w:t>
       </w:r>
     </w:p>
     <w:p>
@@ -9868,7 +9846,6 @@
         <w:rPr>
           <w:noProof/>
         </w:rPr>
-        <w:lastRenderedPageBreak/>
         <w:drawing>
           <wp:inline distT="0" distB="0" distL="0" distR="0">
             <wp:extent cx="6096000" cy="4286250"/>
@@ -9922,7 +9899,17 @@
           <w:sz w:val="18"/>
           <w:szCs w:val="18"/>
         </w:rPr>
-        <w:t>Figure 6: The Help page questions, one of them opened</w:t>
+        <w:t>Figure 6: The Help page questions, one o</w:t>
+      </w:r>
+      <w:r>
+        <w:rPr>
+          <w:i/>
+          <w:iCs/>
+          <w:color w:val="5F6B66"/>
+          <w:sz w:val="18"/>
+          <w:szCs w:val="18"/>
+        </w:rPr>
+        <w:t>f them opened</w:t>
       </w:r>
     </w:p>
     <w:p>
@@ -9935,10 +9922,7 @@
         <w:spacing w:after="60" w:line="264" w:lineRule="auto"/>
       </w:pPr>
       <w:r>
-        <w:t>A search box: every word typed must appear in the question, answer or topic; capitals and punct</w:t>
-      </w:r>
-      <w:r>
-        <w:t>uation don't count, so "mpesa pin" finds "M-Pesa PIN".</w:t>
+        <w:t>A search box: every word typed must appear in the question, answer or topic; capitals and punctuation don't count, so "mpesa pin" finds "M-Pesa PIN".</w:t>
       </w:r>
     </w:p>
     <w:p>
@@ -9964,10 +9948,7 @@
         <w:spacing w:after="60" w:line="264" w:lineRule="auto"/>
       </w:pPr>
       <w:r>
-        <w:t>Each question opens to its answer. Lines starting "1. ", "2. " show as numbered steps, and a question can end with a link to the pag</w:t>
-      </w:r>
-      <w:r>
-        <w:t>e it is about ("Go to Shipping"), named as in the menu.</w:t>
+        <w:t>Each question opens to its answer. Lines starting "1. ", "2. " show as numbered steps, and a question can end with a link to the page it is about ("Go to Shipping"), named as in the menu.</w:t>
       </w:r>
     </w:p>
     <w:p>
@@ -9980,7 +9961,10 @@
         <w:spacing w:after="60" w:line="264" w:lineRule="auto"/>
       </w:pPr>
       <w:r>
-        <w:t>With no questions, or when they can't be loaded, the section is left out; the chat and the contacts remain.</w:t>
+        <w:t>With no questions, or when they can't be loaded, the section is left</w:t>
+      </w:r>
+      <w:r>
+        <w:t xml:space="preserve"> out; the chat and the contacts remain.</w:t>
       </w:r>
     </w:p>
     <w:p>
@@ -10003,6 +9987,7 @@
           <w:bCs/>
           <w:color w:val="8A5A2B"/>
         </w:rPr>
+        <w:lastRenderedPageBreak/>
         <w:t xml:space="preserve">Where to adjust: </w:t>
       </w:r>
       <w:r>
@@ -10015,16 +10000,7 @@
           <w:sz w:val="19"/>
           <w:szCs w:val="19"/>
         </w:rPr>
-        <w:t>PAGE_N</w:t>
-      </w:r>
-      <w:r>
-        <w:rPr>
-          <w:rFonts w:ascii="Consolas" w:eastAsia="Consolas" w:hAnsi="Consolas" w:cs="Consolas"/>
-          <w:color w:val="3B3F3D"/>
-          <w:sz w:val="19"/>
-          <w:szCs w:val="19"/>
-        </w:rPr>
-        <w:t>AMES</w:t>
+        <w:t>PAGE_NAMES</w:t>
       </w:r>
       <w:r>
         <w:t xml:space="preserve"> in </w:t>
@@ -10072,7 +10048,16 @@
           <w:sz w:val="19"/>
           <w:szCs w:val="19"/>
         </w:rPr>
-        <w:t>.help-faq</w:t>
+        <w:t>.hel</w:t>
+      </w:r>
+      <w:r>
+        <w:rPr>
+          <w:rFonts w:ascii="Consolas" w:eastAsia="Consolas" w:hAnsi="Consolas" w:cs="Consolas"/>
+          <w:color w:val="3B3F3D"/>
+          <w:sz w:val="19"/>
+          <w:szCs w:val="19"/>
+        </w:rPr>
+        <w:t>p-faq</w:t>
       </w:r>
       <w:r>
         <w:t xml:space="preserve"> in </w:t>
@@ -10094,7 +10079,7 @@
       <w:pPr>
         <w:pStyle w:val="Heading2"/>
       </w:pPr>
-      <w:bookmarkStart w:id="18" w:name="_Toc243679770"/>
+      <w:bookmarkStart w:id="18" w:name="_Toc243680539"/>
       <w:r>
         <w:t>4.11  Send us an email</w:t>
       </w:r>
@@ -10105,13 +10090,10 @@
         <w:spacing w:after="120" w:line="276" w:lineRule="auto"/>
       </w:pPr>
       <w:r>
-        <w:t>Since 7 October 2026 a customer can write to the support team on the site itse</w:t>
-      </w:r>
-      <w:r>
-        <w:t>lf - "just like what they would have done in their outlook or gmail web", without opening an email app (sent by the website server, see the Website Server document). "i want that email thingy to appear once some one clicks on the email": the form is a wind</w:t>
-      </w:r>
-      <w:r>
-        <w:t>ow over the page (</w:t>
+        <w:t xml:space="preserve">Since 7 October 2026 a customer can write to the support team on the site itself - "just like what they would have done in their outlook or gmail web", without opening an email app (sent by the website </w:t>
+      </w:r>
+      <w:r>
+        <w:t>server, see the Website Server document). "i want that email thingy to appear once some one clicks on the email": the form is a window over the page (</w:t>
       </w:r>
       <w:r>
         <w:rPr>
@@ -10123,10 +10105,10 @@
         <w:t>src/components/EmailDialog.jsx</w:t>
       </w:r>
       <w:r>
-        <w:t>), opened by the Send us an email button on the Help page and on the Bulk Orders page, where the subject starts as "Bulk order enquiry". While the website server has no email settings, the same buttons open t</w:t>
-      </w:r>
-      <w:r>
-        <w:t>he visitor's email app as before.</w:t>
+        <w:t>), opened by the Send us an email button on the Help page and on the Bulk Or</w:t>
+      </w:r>
+      <w:r>
+        <w:t>ders page, where the subject starts as "Bulk order enquiry". While the website server has no email settings, the same buttons open the visitor's email app as before.</w:t>
       </w:r>
     </w:p>
     <w:p>
@@ -10139,7 +10121,6 @@
         <w:rPr>
           <w:noProof/>
         </w:rPr>
-        <w:lastRenderedPageBreak/>
         <w:drawing>
           <wp:inline distT="0" distB="0" distL="0" distR="0">
             <wp:extent cx="6096000" cy="4286250"/>
@@ -10206,6 +10187,7 @@
         <w:rPr>
           <w:noProof/>
         </w:rPr>
+        <w:lastRenderedPageBreak/>
         <w:drawing>
           <wp:inline distT="0" distB="0" distL="0" distR="0">
             <wp:extent cx="6096000" cy="4286250"/>
@@ -10259,7 +10241,17 @@
           <w:sz w:val="18"/>
           <w:szCs w:val="18"/>
         </w:rPr>
-        <w:t>Figure 8: The Send us an email window (sample customer), with the suggestion for a mistyped address</w:t>
+        <w:t>Fig</w:t>
+      </w:r>
+      <w:r>
+        <w:rPr>
+          <w:i/>
+          <w:iCs/>
+          <w:color w:val="5F6B66"/>
+          <w:sz w:val="18"/>
+          <w:szCs w:val="18"/>
+        </w:rPr>
+        <w:t>ure 8: The Send us an email window (sample customer), with the suggestion for a mistyped address</w:t>
       </w:r>
     </w:p>
     <w:p>
@@ -10272,11 +10264,10 @@
         <w:spacing w:after="60" w:line="264" w:lineRule="auto"/>
       </w:pPr>
       <w:r>
-        <w:lastRenderedPageBreak/>
-        <w:t>To is fixed (the support team); the</w:t>
-      </w:r>
-      <w:r>
-        <w:t xml:space="preserve"> customer fills in their name, email, an optional phone number, a subject and the message (10 to 4,000 characters, with a counter).</w:t>
+        <w:t>To is fixed (the support team); the customer fills in their name, email, an optional phone number, a subject and the message (10 to 4,000 characters, with a co</w:t>
+      </w:r>
+      <w:r>
+        <w:t>unter).</w:t>
       </w:r>
     </w:p>
     <w:p>
@@ -10302,10 +10293,7 @@
         <w:spacing w:after="60" w:line="264" w:lineRule="auto"/>
       </w:pPr>
       <w:r>
-        <w:t>Signed in: the phone field starts with the phone number on the acco</w:t>
-      </w:r>
-      <w:r>
-        <w:t>unt.</w:t>
+        <w:t>Signed in: the phone field starts with the phone number on the account.</w:t>
       </w:r>
     </w:p>
     <w:p>
@@ -10318,7 +10306,10 @@
         <w:spacing w:after="60" w:line="264" w:lineRule="auto"/>
       </w:pPr>
       <w:r>
-        <w:t>Signed in: name and email come from the account and can't be changed ("From your account - we reply here"). Not signed in: a mistyped address gets a suggestion, as at sign-up ("Did you mean ...@gmail.com?").</w:t>
+        <w:t>Signed in: name and email come from the account and can't be changed ("From your account - we reply here"). Not signed in: a mistyped address gets a suggestion, as at sign-up ("Did you</w:t>
+      </w:r>
+      <w:r>
+        <w:t xml:space="preserve"> mean ...@gmail.com?").</w:t>
       </w:r>
     </w:p>
     <w:p>
@@ -10331,10 +10322,7 @@
         <w:spacing w:after="60" w:line="264" w:lineRule="auto"/>
       </w:pPr>
       <w:r>
-        <w:t>After Send: "Sent", the address the reply w</w:t>
-      </w:r>
-      <w:r>
-        <w:t>ill go to, and whether a copy (signed in) or a short confirmation (not signed in) is on its way; "Write another" clears subject and message.</w:t>
+        <w:t>After Send: "Sent", the address the reply will go to, and whether a copy (signed in) or a short confirmation (not signed in) is on its way; "Write another" clears subject and message.</w:t>
       </w:r>
     </w:p>
     <w:p>
@@ -10347,7 +10335,10 @@
         <w:spacing w:after="60" w:line="264" w:lineRule="auto"/>
       </w:pPr>
       <w:r>
-        <w:t>A hidden field only bots fill in, and the time the form was open, help the server spot automated sending.</w:t>
+        <w:t>A hidden field only bots fill in, and the time t</w:t>
+      </w:r>
+      <w:r>
+        <w:t>he form was open, help the server spot automated sending.</w:t>
       </w:r>
     </w:p>
     <w:p>
@@ -10360,10 +10351,7 @@
         <w:spacing w:after="60" w:line="264" w:lineRule="auto"/>
       </w:pPr>
       <w:r>
-        <w:t>At the bo</w:t>
-      </w:r>
-      <w:r>
-        <w:t>ttom, "Prefer your own email app? Open it" opens the visitor's email app with the subject and message typed so far, and the address is shown to copy.</w:t>
+        <w:t>At the bottom, "Prefer your own email app? Open it" opens the visitor's email app with the subject and message typed so far, and the address is shown to copy.</w:t>
       </w:r>
     </w:p>
     <w:p>
@@ -10376,10 +10364,10 @@
         <w:spacing w:after="60" w:line="264" w:lineRule="auto"/>
       </w:pPr>
       <w:r>
-        <w:t>The window closes with the cross, Escape or a click outside it. Closing keeps what was typed until the pag</w:t>
-      </w:r>
-      <w:r>
-        <w:t>e is left; after Send, Done closes it and the next one starts with an empty subject and message.</w:t>
+        <w:t>The window closes with the cross, Escap</w:t>
+      </w:r>
+      <w:r>
+        <w:t>e or a click outside it. Closing keeps what was typed until the page is left; after Send, Done closes it and the next one starts with an empty subject and message.</w:t>
       </w:r>
     </w:p>
     <w:p>
@@ -10414,7 +10402,16 @@
           <w:sz w:val="19"/>
           <w:szCs w:val="19"/>
         </w:rPr>
-        <w:t>src/components/EmailDialog.jsx</w:t>
+        <w:t>src/components/EmailDialog.js</w:t>
+      </w:r>
+      <w:r>
+        <w:rPr>
+          <w:rFonts w:ascii="Consolas" w:eastAsia="Consolas" w:hAnsi="Consolas" w:cs="Consolas"/>
+          <w:color w:val="3B3F3D"/>
+          <w:sz w:val="19"/>
+          <w:szCs w:val="19"/>
+        </w:rPr>
+        <w:t>x</w:t>
       </w:r>
       <w:r>
         <w:t xml:space="preserve"> and </w:t>
@@ -10450,16 +10447,7 @@
           <w:sz w:val="19"/>
           <w:szCs w:val="19"/>
         </w:rPr>
-        <w:t>.email-</w:t>
-      </w:r>
-      <w:r>
-        <w:rPr>
-          <w:rFonts w:ascii="Consolas" w:eastAsia="Consolas" w:hAnsi="Consolas" w:cs="Consolas"/>
-          <w:color w:val="3B3F3D"/>
-          <w:sz w:val="19"/>
-          <w:szCs w:val="19"/>
-        </w:rPr>
-        <w:t>modal</w:t>
+        <w:t>.email-modal</w:t>
       </w:r>
       <w:r>
         <w:t xml:space="preserve"> and </w:t>
@@ -10493,7 +10481,7 @@
       <w:pPr>
         <w:pStyle w:val="Heading2"/>
       </w:pPr>
-      <w:bookmarkStart w:id="19" w:name="_Toc243679771"/>
+      <w:bookmarkStart w:id="19" w:name="_Toc243680540"/>
       <w:r>
         <w:t>4.12  Bulk order pictures</w:t>
       </w:r>
@@ -10504,10 +10492,14 @@
         <w:spacing w:after="120" w:line="276" w:lineRule="auto"/>
       </w:pPr>
       <w:r>
-        <w:t>Since 9 October 2026 the Bulk Orders page shows what a bulk order looks like: "pictures that can be used to show case what bulk orders look like so that customers can see a template o</w:t>
-      </w:r>
-      <w:r>
-        <w:t>f what is meant by bulk orders ... like a slide". The pictures are not products; Marketers, Admins and the SuperAdmin keep them in Marketing in the phone and desktop apps (see those documents). With no pictures, the page is as before.</w:t>
+        <w:t xml:space="preserve">Since 9 October 2026 the Bulk Orders page shows what a bulk order looks like: "pictures that can be used to show case what bulk orders look like so that customers can see a template of what is meant by bulk orders ... </w:t>
+      </w:r>
+      <w:r>
+        <w:lastRenderedPageBreak/>
+        <w:t>like a slide". The pictures are not pr</w:t>
+      </w:r>
+      <w:r>
+        <w:t>oducts; Marketers, Admins and the SuperAdmin keep them in Marketing in the phone and desktop apps (see those documents). With no pictures, the page is as before.</w:t>
       </w:r>
     </w:p>
     <w:p>
@@ -10520,7 +10512,6 @@
         <w:rPr>
           <w:noProof/>
         </w:rPr>
-        <w:lastRenderedPageBreak/>
         <w:drawing>
           <wp:inline distT="0" distB="0" distL="0" distR="0">
             <wp:extent cx="6096000" cy="4286250"/>
@@ -10574,17 +10565,7 @@
           <w:sz w:val="18"/>
           <w:szCs w:val="18"/>
         </w:rPr>
-        <w:t xml:space="preserve">Figure 9: The Bulk </w:t>
-      </w:r>
-      <w:r>
-        <w:rPr>
-          <w:i/>
-          <w:iCs/>
-          <w:color w:val="5F6B66"/>
-          <w:sz w:val="18"/>
-          <w:szCs w:val="18"/>
-        </w:rPr>
-        <w:t>Orders page with its slideshow (sample pictures)</w:t>
+        <w:t>Figure 9: The Bulk Orders page with its slideshow (sample pictures)</w:t>
       </w:r>
     </w:p>
     <w:p>
@@ -10597,10 +10578,10 @@
         <w:spacing w:after="60" w:line="264" w:lineRule="auto"/>
       </w:pPr>
       <w:r>
-        <w:t xml:space="preserve">One picture at a time, cross-fading to the next every 5 seconds. It waits while the mouse is over it, a finger is on it or it has the keyboard focus, and while the tab is in the background; after any change </w:t>
-      </w:r>
-      <w:r>
-        <w:t>the next one is a full 5 seconds away.</w:t>
+        <w:t>One picture at a time, c</w:t>
+      </w:r>
+      <w:r>
+        <w:t>ross-fading to the next every 5 seconds. It waits while the mouse is over it, a finger is on it or it has the keyboard focus, and while the tab is in the background; after any change the next one is a full 5 seconds away.</w:t>
       </w:r>
     </w:p>
     <w:p>
@@ -10613,7 +10594,10 @@
         <w:spacing w:after="60" w:line="264" w:lineRule="auto"/>
       </w:pPr>
       <w:r>
-        <w:t>Arrows at the sides, dots underneath (the current one a wood bar), the left and right arrow keys, and a swipe on a phone.</w:t>
+        <w:t>Arrows at the sides, dots undernea</w:t>
+      </w:r>
+      <w:r>
+        <w:t>th (the current one a wood bar), the left and right arrow keys, and a swipe on a phone.</w:t>
       </w:r>
     </w:p>
     <w:p>
@@ -10626,10 +10610,10 @@
         <w:spacing w:after="60" w:line="264" w:lineRule="auto"/>
       </w:pPr>
       <w:r>
-        <w:t xml:space="preserve">Each picture is shown whole - upright phone photos are not cut - over a blurred, darkened copy </w:t>
-      </w:r>
-      <w:r>
-        <w:t>of itself that fills the frame (16:9 on a computer, 4:3 on a phone). The caption, when there is one, sits along the bottom.</w:t>
+        <w:t xml:space="preserve">Each picture is shown whole - upright phone photos are not cut - over a blurred, darkened copy of itself that fills the frame (16:9 on a computer, 4:3 on a phone). The </w:t>
+      </w:r>
+      <w:r>
+        <w:t>caption, when there is one, sits along the bottom.</w:t>
       </w:r>
     </w:p>
     <w:p>
@@ -10665,15 +10649,7 @@
           <w:bCs/>
           <w:color w:val="8A5A2B"/>
         </w:rPr>
-        <w:t>Where</w:t>
-      </w:r>
-      <w:r>
-        <w:rPr>
-          <w:b/>
-          <w:bCs/>
-          <w:color w:val="8A5A2B"/>
-        </w:rPr>
-        <w:t xml:space="preserve"> to adjust: </w:t>
+        <w:t xml:space="preserve">Where to adjust: </w:t>
       </w:r>
       <w:r>
         <w:t xml:space="preserve">Timing and swipe distance: </w:t>
@@ -10709,7 +10685,16 @@
           <w:sz w:val="19"/>
           <w:szCs w:val="19"/>
         </w:rPr>
-        <w:t>src/components/ShowcaseSlider.jsx</w:t>
+        <w:t>src/com</w:t>
+      </w:r>
+      <w:r>
+        <w:rPr>
+          <w:rFonts w:ascii="Consolas" w:eastAsia="Consolas" w:hAnsi="Consolas" w:cs="Consolas"/>
+          <w:color w:val="3B3F3D"/>
+          <w:sz w:val="19"/>
+          <w:szCs w:val="19"/>
+        </w:rPr>
+        <w:t>ponents/ShowcaseSlider.jsx</w:t>
       </w:r>
       <w:r>
         <w:t xml:space="preserve">. Heading: </w:t>
@@ -10755,7 +10740,7 @@
       <w:pPr>
         <w:pStyle w:val="Heading2"/>
       </w:pPr>
-      <w:bookmarkStart w:id="20" w:name="_Toc243679772"/>
+      <w:bookmarkStart w:id="20" w:name="_Toc243680541"/>
       <w:r>
         <w:t>4.13  Chat assistant and nudges</w:t>
       </w:r>
@@ -10766,10 +10751,7 @@
         <w:spacing w:after="120" w:line="276" w:lineRule="auto"/>
       </w:pPr>
       <w:r>
-        <w:t>See the AI Assistant document (DWS-BE-04)</w:t>
-      </w:r>
-      <w:r>
-        <w:t xml:space="preserve">. Timings are in </w:t>
+        <w:t xml:space="preserve">See the AI Assistant document (DWS-BE-04). Timings are in </w:t>
       </w:r>
       <w:r>
         <w:rPr>
@@ -10793,7 +10775,10 @@
         <w:t>src/context/ChatNudgeContext.jsx</w:t>
       </w:r>
       <w:r>
-        <w:t xml:space="preserve">; one-tap questions are </w:t>
+        <w:t>; one-ta</w:t>
+      </w:r>
+      <w:r>
+        <w:t xml:space="preserve">p questions are </w:t>
       </w:r>
       <w:r>
         <w:rPr>
@@ -10829,7 +10814,7 @@
       <w:pPr>
         <w:pStyle w:val="Heading1"/>
       </w:pPr>
-      <w:bookmarkStart w:id="21" w:name="_Toc243679773"/>
+      <w:bookmarkStart w:id="21" w:name="_Toc243680542"/>
       <w:r>
         <w:lastRenderedPageBreak/>
         <w:t>5  Brand style</w:t>
@@ -10840,7 +10825,7 @@
       <w:pPr>
         <w:pStyle w:val="Heading2"/>
       </w:pPr>
-      <w:bookmarkStart w:id="22" w:name="_Toc243679774"/>
+      <w:bookmarkStart w:id="22" w:name="_Toc243680543"/>
       <w:r>
         <w:t>5.1  Company emblem</w:t>
       </w:r>
@@ -10851,10 +10836,10 @@
         <w:spacing w:after="120" w:line="276" w:lineRule="auto"/>
       </w:pPr>
       <w:r>
-        <w:t>Since 7 October 2026 the company emblem is the one on the delivery lorry in the About film ("i want to use it as the company log"), redrawn as clean gold lines on near-black without changing its design ("enhance it ... without having to restructure it so m</w:t>
-      </w:r>
-      <w:r>
-        <w:t>uch"): the end of a log with its wavy bark edge and growth rings, and a tree whose leafy canopy is the innermost ring. The drawing is code (</w:t>
+        <w:t>Since 7 October 2026 the company emblem is the one on the delivery lorry in the About film ("i want to use it as the company log"), redrawn as clean gold</w:t>
+      </w:r>
+      <w:r>
+        <w:t xml:space="preserve"> lines on near-black without changing its design ("enhance it ... without having to restructure it so much"): the end of a log with its wavy bark edge and growth rings, and a tree whose leafy canopy is the innermost ring. The drawing is code (</w:t>
       </w:r>
       <w:r>
         <w:rPr>
@@ -10951,7 +10936,7 @@
           <w:left w:w="10" w:type="dxa"/>
           <w:right w:w="10" w:type="dxa"/>
         </w:tblCellMar>
-        <w:tblLook w:val="0000" w:firstRow="0" w:lastRow="0" w:firstColumn="0" w:lastColumn="0" w:noHBand="0" w:noVBand="0"/>
+        <w:tblLook w:val="04A0" w:firstRow="1" w:lastRow="0" w:firstColumn="1" w:lastColumn="0" w:noHBand="0" w:noVBand="1"/>
       </w:tblPr>
       <w:tblGrid>
         <w:gridCol w:w="3579"/>
@@ -11054,16 +11039,7 @@
                 <w:sz w:val="19"/>
                 <w:szCs w:val="19"/>
               </w:rPr>
-              <w:t>public/favicon</w:t>
-            </w:r>
-            <w:r>
-              <w:rPr>
-                <w:b/>
-                <w:bCs/>
-                <w:sz w:val="19"/>
-                <w:szCs w:val="19"/>
-              </w:rPr>
-              <w:t>.svg, public/favicon.ico</w:t>
+              <w:t>public/favicon.svg, public/favicon.ico</w:t>
             </w:r>
           </w:p>
         </w:tc>
@@ -11086,14 +11062,14 @@
                 <w:sz w:val="19"/>
                 <w:szCs w:val="19"/>
               </w:rPr>
-              <w:t>The browser tab. Browsers draw tab icons in a fixed small square, so since 8 October 2026 the emblem fills all of it ("can we make it a little more visible ... without having to affect size allowed in the browser area"): its wavy b</w:t>
-            </w:r>
-            <w:r>
-              <w:rPr>
-                <w:sz w:val="19"/>
-                <w:szCs w:val="19"/>
-              </w:rPr>
-              <w:t>ark edge is the outline of the icon, dark inside, with the thickest lines (</w:t>
+              <w:t>The browser tab. Browsers draw tab icons in a fixed small square, so since 8 October 2026 the emblem fills all of it ("can we make it a little more visible ... without having to affect size allowed i</w:t>
+            </w:r>
+            <w:r>
+              <w:rPr>
+                <w:sz w:val="19"/>
+                <w:szCs w:val="19"/>
+              </w:rPr>
+              <w:t>n the browser area"): its wavy bark edge is the outline of the icon, dark inside, with the thickest lines (</w:t>
             </w:r>
             <w:r>
               <w:rPr>
@@ -11523,7 +11499,7 @@
       <w:pPr>
         <w:pStyle w:val="Heading2"/>
       </w:pPr>
-      <w:bookmarkStart w:id="23" w:name="_Toc243679775"/>
+      <w:bookmarkStart w:id="23" w:name="_Toc243680544"/>
       <w:r>
         <w:lastRenderedPageBreak/>
         <w:t>5.2  Footer</w:t>
@@ -11638,7 +11614,7 @@
       <w:pPr>
         <w:pStyle w:val="Heading2"/>
       </w:pPr>
-      <w:bookmarkStart w:id="24" w:name="_Toc243679776"/>
+      <w:bookmarkStart w:id="24" w:name="_Toc243680545"/>
       <w:r>
         <w:t>5.3  Colours, wood and icons</w:t>
       </w:r>
@@ -11721,10 +11697,10 @@
         <w:spacing w:after="60" w:line="264" w:lineRule="auto"/>
       </w:pPr>
       <w:r>
-        <w:t>Colour themes (since 20 October 2026: "is it possible to add more themes like the dark and light theme and what we have will be default"): Forest is the default,</w:t>
-      </w:r>
-      <w:r>
-        <w:t xml:space="preserve"> Dark is charcoal greys, Light is warm paper with dark text and a darker, barkier wood for small text. Every colour is a variable with a value per theme (</w:t>
+        <w:t>Colour themes (since 20 October 2026: "is it possible to add more themes like the dark and light theme and what we have will be default"): Forest is the default, Dark is charcoal greys, Light is warm paper with dark text and a darker, barkier wood for smal</w:t>
+      </w:r>
+      <w:r>
+        <w:t>l text. Every colour is a variable with a value per theme (</w:t>
       </w:r>
       <w:r>
         <w:rPr>
@@ -11760,10 +11736,10 @@
         <w:t>--ink-rgb</w:t>
       </w:r>
       <w:r>
-        <w:t xml:space="preserve"> (white on the dark </w:t>
-      </w:r>
-      <w:r>
-        <w:t xml:space="preserve">themes, black on Light). The About story and the sign-in photo panel are built on dark photographs and keep the Forest colours in every theme. A small script in </w:t>
+        <w:t xml:space="preserve"> (white on the dark themes, black on Light). The About story and the sign-in photo panel are built on dark photogra</w:t>
+      </w:r>
+      <w:r>
+        <w:t xml:space="preserve">phs and keep the Forest colours in every theme. A small script in </w:t>
       </w:r>
       <w:r>
         <w:rPr>
@@ -11800,7 +11776,10 @@
         <w:t>src/wood/woodPaint.js</w:t>
       </w:r>
       <w:r>
-        <w:t>) paints the Dateroem wordmark (whose letters form the rings of a cut log) and the plank and log-end textures used on buttons and highlights.</w:t>
+        <w:t>) paints the Dateroem wordmark (whose letters form the rings o</w:t>
+      </w:r>
+      <w:r>
+        <w:t>f a cut log) and the plank and log-end textures used on buttons and highlights.</w:t>
       </w:r>
     </w:p>
     <w:p>
@@ -11835,10 +11814,7 @@
         <w:t>scripts/paint-wood-textures.mjs</w:t>
       </w:r>
       <w:r>
-        <w:t xml:space="preserve">, so the textures always </w:t>
-      </w:r>
-      <w:r>
-        <w:t>match the wordmark.</w:t>
+        <w:t>, so the textures always match the wordmark.</w:t>
       </w:r>
     </w:p>
     <w:p>
@@ -11860,7 +11836,10 @@
         <w:t>npm run wood:export -- --mobile &lt;mobile project&gt; ...</w:t>
       </w:r>
       <w:r>
-        <w:t xml:space="preserve"> renders the same wood images for the mobile and desktop apps.</w:t>
+        <w:t xml:space="preserve"> renders the same wood </w:t>
+      </w:r>
+      <w:r>
+        <w:t>images for the mobile and desktop apps.</w:t>
       </w:r>
     </w:p>
     <w:p>
@@ -11885,10 +11864,7 @@
         <w:t>src/styles/index.css</w:t>
       </w:r>
       <w:r>
-        <w:t>. Small "forest" motions (things growing into place) respect the reduced-motion set</w:t>
-      </w:r>
-      <w:r>
-        <w:t>ting.</w:t>
+        <w:t>. Small "forest" motions (things growing into place) respect the reduced-motion setting.</w:t>
       </w:r>
     </w:p>
     <w:p>
@@ -11984,7 +11960,17 @@
           <w:sz w:val="18"/>
           <w:szCs w:val="18"/>
         </w:rPr>
-        <w:t>Figure 12: The Theme menu at the end of the top links (Light)</w:t>
+        <w:t>Figure 12: The Theme</w:t>
+      </w:r>
+      <w:r>
+        <w:rPr>
+          <w:i/>
+          <w:iCs/>
+          <w:color w:val="5F6B66"/>
+          <w:sz w:val="18"/>
+          <w:szCs w:val="18"/>
+        </w:rPr>
+        <w:t xml:space="preserve"> menu at the end of the top links (Light)</w:t>
       </w:r>
     </w:p>
     <w:p>
@@ -12062,7 +12048,7 @@
       <w:pPr>
         <w:pStyle w:val="Heading1"/>
       </w:pPr>
-      <w:bookmarkStart w:id="25" w:name="_Toc243679777"/>
+      <w:bookmarkStart w:id="25" w:name="_Toc243680546"/>
       <w:r>
         <w:lastRenderedPageBreak/>
         <w:t>6  Privacy and analytics</w:t>
@@ -12074,7 +12060,10 @@
         <w:spacing w:after="120" w:line="276" w:lineRule="auto"/>
       </w:pPr>
       <w:r>
-        <w:t xml:space="preserve">Only strictly necessary storage is used without consent: the sign-in token and the cart. The closed-banner and video-position notes are kept only in the visitor's own browser and are never sent anywhere. Google Analytics 4 (measurement id in </w:t>
+        <w:t>Only strictly necessary storage is used without consent: the sign-in token and the cart. The closed-banner and video-position note</w:t>
+      </w:r>
+      <w:r>
+        <w:t xml:space="preserve">s are kept only in the visitor's own browser and are never sent anywhere. Google Analytics 4 (measurement id in </w:t>
       </w:r>
       <w:r>
         <w:rPr>
@@ -12083,16 +12072,7 @@
           <w:sz w:val="19"/>
           <w:szCs w:val="19"/>
         </w:rPr>
-        <w:t>VITE_GA_MEASUR</w:t>
-      </w:r>
-      <w:r>
-        <w:rPr>
-          <w:rFonts w:ascii="Consolas" w:eastAsia="Consolas" w:hAnsi="Consolas" w:cs="Consolas"/>
-          <w:color w:val="3B3F3D"/>
-          <w:sz w:val="19"/>
-          <w:szCs w:val="19"/>
-        </w:rPr>
-        <w:t>EMENT_ID</w:t>
+        <w:t>VITE_GA_MEASUREMENT_ID</w:t>
       </w:r>
       <w:r>
         <w:t>) is loaded only after the visitor allows the analytics category. Chat nudge events (</w:t>
@@ -12116,7 +12096,16 @@
           <w:sz w:val="19"/>
           <w:szCs w:val="19"/>
         </w:rPr>
-        <w:t>chat_opened_after_nudge</w:t>
+        <w:t>chat_opened_after_n</w:t>
+      </w:r>
+      <w:r>
+        <w:rPr>
+          <w:rFonts w:ascii="Consolas" w:eastAsia="Consolas" w:hAnsi="Consolas" w:cs="Consolas"/>
+          <w:color w:val="3B3F3D"/>
+          <w:sz w:val="19"/>
+          <w:szCs w:val="19"/>
+        </w:rPr>
+        <w:t>udge</w:t>
       </w:r>
       <w:r>
         <w:t xml:space="preserve">, </w:t>
@@ -12143,7 +12132,7 @@
       <w:pPr>
         <w:pStyle w:val="Heading1"/>
       </w:pPr>
-      <w:bookmarkStart w:id="26" w:name="_Toc243679778"/>
+      <w:bookmarkStart w:id="26" w:name="_Toc243680547"/>
       <w:r>
         <w:lastRenderedPageBreak/>
         <w:t>7  Configuration</w:t>
@@ -12166,7 +12155,7 @@
           <w:left w:w="10" w:type="dxa"/>
           <w:right w:w="10" w:type="dxa"/>
         </w:tblCellMar>
-        <w:tblLook w:val="0000" w:firstRow="0" w:lastRow="0" w:firstColumn="0" w:lastColumn="0" w:noHBand="0" w:noVBand="0"/>
+        <w:tblLook w:val="04A0" w:firstRow="1" w:lastRow="0" w:firstColumn="1" w:lastColumn="0" w:noHBand="0" w:noVBand="1"/>
       </w:tblPr>
       <w:tblGrid>
         <w:gridCol w:w="3125"/>
@@ -12207,17 +12196,7 @@
                 <w:sz w:val="19"/>
                 <w:szCs w:val="19"/>
               </w:rPr>
-              <w:t>Setting (frontend/website</w:t>
-            </w:r>
-            <w:r>
-              <w:rPr>
-                <w:b/>
-                <w:bCs/>
-                <w:color w:val="FFFFFF"/>
-                <w:sz w:val="19"/>
-                <w:szCs w:val="19"/>
-              </w:rPr>
-              <w:t>/.env)</w:t>
+              <w:t>Setting (frontend/website/.env)</w:t>
             </w:r>
           </w:p>
         </w:tc>
@@ -12475,7 +12454,7 @@
       <w:pPr>
         <w:pStyle w:val="Heading1"/>
       </w:pPr>
-      <w:bookmarkStart w:id="27" w:name="_Toc243679779"/>
+      <w:bookmarkStart w:id="27" w:name="_Toc243680548"/>
       <w:r>
         <w:lastRenderedPageBreak/>
         <w:t>8  Build, preview and publish</w:t>
@@ -12579,10 +12558,10 @@
         <w:spacing w:after="120" w:line="276" w:lineRule="auto"/>
       </w:pPr>
       <w:r>
-        <w:t>Visitors reach the public build through ngrok and the Caddy router, which sends every path that is not an app, download or payment path to port 4173. The desktop Servers section rebuilds a</w:t>
-      </w:r>
-      <w:r>
-        <w:t xml:space="preserve">nd serves it with one click ("Website (public build)"). A running preview serves a new build as soon as </w:t>
+        <w:t>Visitors reach the public build thro</w:t>
+      </w:r>
+      <w:r>
+        <w:t xml:space="preserve">ugh ngrok and the Caddy router, which sends every path that is not an app, download or payment path to port 4173. The desktop Servers section rebuilds and serves it with one click ("Website (public build)"). A running preview serves a new build as soon as </w:t>
       </w:r>
       <w:r>
         <w:rPr>
@@ -12601,7 +12580,7 @@
       <w:pPr>
         <w:pStyle w:val="Heading2"/>
       </w:pPr>
-      <w:bookmarkStart w:id="28" w:name="_Toc243679780"/>
+      <w:bookmarkStart w:id="28" w:name="_Toc243680549"/>
       <w:r>
         <w:t>8.1  When something goes wrong</w:t>
       </w:r>
@@ -12612,10 +12591,7 @@
         <w:spacing w:after="120" w:line="276" w:lineRule="auto"/>
       </w:pPr>
       <w:r>
-        <w:t>"in the event of an error e.g the server is offline ... the user ... never gets the whole details</w:t>
-      </w:r>
-      <w:r>
-        <w:t xml:space="preserve"> but what is necessary and presentable" (18 October 2026). Every message a visitor sees comes from </w:t>
+        <w:t xml:space="preserve">"in the event of an error e.g the server is offline ... the user ... never gets the whole details but what is necessary and presentable" (18 October 2026). Every message a visitor sees comes from </w:t>
       </w:r>
       <w:r>
         <w:rPr>
@@ -12624,7 +12600,16 @@
           <w:sz w:val="19"/>
           <w:szCs w:val="19"/>
         </w:rPr>
-        <w:t>apiErrorMessage</w:t>
+        <w:t>apiEr</w:t>
+      </w:r>
+      <w:r>
+        <w:rPr>
+          <w:rFonts w:ascii="Consolas" w:eastAsia="Consolas" w:hAnsi="Consolas" w:cs="Consolas"/>
+          <w:color w:val="3B3F3D"/>
+          <w:sz w:val="19"/>
+          <w:szCs w:val="19"/>
+        </w:rPr>
+        <w:t>rorMessage</w:t>
       </w:r>
       <w:r>
         <w:t xml:space="preserve"> in </w:t>
@@ -12639,13 +12624,13 @@
         <w:t>src/api/client.js</w:t>
       </w:r>
       <w:r>
-        <w:t>: the server's own reason when it is meant for people ("Not enough stock ...", "That code isn't right"), otherwise one ca</w:t>
-      </w:r>
-      <w:r>
-        <w:t>lm sentence - "We can't reach Dateroem right now. Please try again in a few minutes." (server down), "Something went wrong on our side. Please try again in a moment." (a problem on the server), "You seem to be offline ..." (no connection), or a plain sente</w:t>
-      </w:r>
-      <w:r>
-        <w:t>nce for "please sign in again", "you don't have access", "too many tries". Never a status code, a raw reply or browser error text.</w:t>
+        <w:t>: the server's own reason when it is meant for people ("Not enough stock ...", "That code isn't right"), otherwise one calm sentence - "We can't reach Dateroem right now. Please try again in a few minutes." (server down), "So</w:t>
+      </w:r>
+      <w:r>
+        <w:t>mething went wrong on our side. Please try again in a moment." (a problem on the server), "You seem to be offline ..." (no connection), or a plain sentence for "please sign in again", "you don't have access", "too many tries". Never a status code, a raw re</w:t>
+      </w:r>
+      <w:r>
+        <w:t>ply or browser error text.</w:t>
       </w:r>
     </w:p>
     <w:p>
@@ -12653,10 +12638,10 @@
         <w:spacing w:after="120" w:line="276" w:lineRule="auto"/>
       </w:pPr>
       <w:r>
-        <w:t xml:space="preserve">While the website itself is down, the router answers the page with "We'll be right back" - the company emblem, a short note, </w:t>
-      </w:r>
-      <w:r>
-        <w:t>the company number to call or WhatsApp - and reloads it by itself once the site is back (see the Running and Operating document).</w:t>
+        <w:t>While the website itself is down, the router answers the page with "We'll be right back" - the company emblem, a short note, the company number to call or WhatsApp - and reloads it by itself once the site is back (see the Running</w:t>
+      </w:r>
+      <w:r>
+        <w:t xml:space="preserve"> and Operating document).</w:t>
       </w:r>
     </w:p>
     <w:p>
@@ -12701,7 +12686,7 @@
       <w:pPr>
         <w:pStyle w:val="Heading1"/>
       </w:pPr>
-      <w:bookmarkStart w:id="29" w:name="_Toc243679781"/>
+      <w:bookmarkStart w:id="29" w:name="_Toc243680550"/>
       <w:r>
         <w:lastRenderedPageBreak/>
         <w:t>9  Development history</w:t>
@@ -12724,7 +12709,7 @@
           <w:left w:w="10" w:type="dxa"/>
           <w:right w:w="10" w:type="dxa"/>
         </w:tblCellMar>
-        <w:tblLook w:val="0000" w:firstRow="0" w:lastRow="0" w:firstColumn="0" w:lastColumn="0" w:noHBand="0" w:noVBand="0"/>
+        <w:tblLook w:val="04A0" w:firstRow="1" w:lastRow="0" w:firstColumn="1" w:lastColumn="0" w:noHBand="0" w:noVBand="1"/>
       </w:tblPr>
       <w:tblGrid>
         <w:gridCol w:w="1606"/>
@@ -12764,17 +12749,7 @@
                 <w:sz w:val="19"/>
                 <w:szCs w:val="19"/>
               </w:rPr>
-              <w:t>Dat</w:t>
-            </w:r>
-            <w:r>
-              <w:rPr>
-                <w:b/>
-                <w:bCs/>
-                <w:color w:val="FFFFFF"/>
-                <w:sz w:val="19"/>
-                <w:szCs w:val="19"/>
-              </w:rPr>
-              <w:t>e</w:t>
+              <w:t>Date</w:t>
             </w:r>
           </w:p>
         </w:tc>
@@ -13149,14 +13124,7 @@
                 <w:sz w:val="19"/>
                 <w:szCs w:val="19"/>
               </w:rPr>
-              <w:t>STK payment confirmed end to end (callback and status query), Ordered Goods page</w:t>
-            </w:r>
-            <w:r>
-              <w:rPr>
-                <w:sz w:val="19"/>
-                <w:szCs w:val="19"/>
-              </w:rPr>
-              <w:t>, customer-specific order numbers, size-based delivery estimates.</w:t>
+              <w:t>STK payment confirmed end to end (callback and status query), Ordered Goods page, customer-specific order numbers, size-based delivery estimates.</w:t>
             </w:r>
           </w:p>
         </w:tc>
@@ -13634,14 +13602,7 @@
                 <w:sz w:val="19"/>
                 <w:szCs w:val="19"/>
               </w:rPr>
-              <w:t>The customer "Marketing" tab became "Featured": only campaigns that are running (Active, within their dates, with products), the tab s</w:t>
-            </w:r>
-            <w:r>
-              <w:rPr>
-                <w:sz w:val="19"/>
-                <w:szCs w:val="19"/>
-              </w:rPr>
-              <w:t>hown only while one is; a closable banner on the Products page and a tag on featured products.</w:t>
+              <w:t>The customer "Marketing" tab became "Featured": only campaigns that are running (Active, within their dates, with products), the tab shown only while one is; a closable banner on the Products page and a tag on featured products.</w:t>
             </w:r>
           </w:p>
         </w:tc>
@@ -13698,7 +13659,14 @@
                 <w:sz w:val="19"/>
                 <w:szCs w:val="19"/>
               </w:rPr>
-              <w:t>Product pages: "All products" link, the campaign shown in a card under the product details (the video at its own shape with a soft glow either side), video position remembered between pages.</w:t>
+              <w:t xml:space="preserve">Product pages: </w:t>
+            </w:r>
+            <w:r>
+              <w:rPr>
+                <w:sz w:val="19"/>
+                <w:szCs w:val="19"/>
+              </w:rPr>
+              <w:t>"All products" link, the campaign shown in a card under the product details (the video at its own shape with a soft glow either side), video position remembered between pages.</w:t>
             </w:r>
           </w:p>
         </w:tc>
@@ -13757,14 +13725,7 @@
                 <w:sz w:val="19"/>
                 <w:szCs w:val="19"/>
               </w:rPr>
-              <w:t>New sign-in screen with the About film beside the for</w:t>
-            </w:r>
-            <w:r>
-              <w:rPr>
-                <w:sz w:val="19"/>
-                <w:szCs w:val="19"/>
-              </w:rPr>
-              <w:t>m; sign in with username or email; email addresses checked at sign-up (format, mail domain, not already used) with typo suggestions; "+" addresses accepted.</w:t>
+              <w:t>New sign-in screen with the About film beside the form; sign in with username or email; email addresses checked at sign-up (format, mail domain, not already used) with typo suggestions; "+" addresses accepted.</w:t>
             </w:r>
           </w:p>
         </w:tc>
@@ -14127,21 +14088,14 @@
                 <w:sz w:val="19"/>
                 <w:szCs w:val="19"/>
               </w:rPr>
-              <w:t>Co</w:t>
-            </w:r>
-            <w:r>
-              <w:rPr>
-                <w:sz w:val="19"/>
-                <w:szCs w:val="19"/>
-              </w:rPr>
-              <w:t>mpany emblem: the emblem on the delivery lorry in the About film, redrawn as a clean gold logo (log rings and a tree). It is the browser tab and phone home-screen icon; profile pictures for TikTok and Instagram are in brand/. Every page ends with a footer:</w:t>
-            </w:r>
-            <w:r>
-              <w:rPr>
-                <w:sz w:val="19"/>
-                <w:szCs w:val="19"/>
-              </w:rPr>
-              <w:t xml:space="preserve"> the emblem, then WhatsApp, TikTok, Instagram, email and phone.</w:t>
+              <w:t>Company emblem: the emblem on the delivery lorry in the About film, redrawn as a clean gold logo (log rings and a tree). It is the browser tab and phone home-screen icon; profile pictures for TikTok and Instagram are in brand/. Every page ends with a foote</w:t>
+            </w:r>
+            <w:r>
+              <w:rPr>
+                <w:sz w:val="19"/>
+                <w:szCs w:val="19"/>
+              </w:rPr>
+              <w:t>r: the emblem, then WhatsApp, TikTok, Instagram, email and phone.</w:t>
             </w:r>
           </w:p>
         </w:tc>
@@ -14321,14 +14275,14 @@
                 <w:sz w:val="19"/>
                 <w:szCs w:val="19"/>
               </w:rPr>
-              <w:t xml:space="preserve">Bulk order pictures: example photos of real bulk orders play as a slideshow on the website's Bulk Orders page (whole picture, optional caption, moves on every 5 seconds). Marketers, Admins and the SuperAdmin add, caption, put in order and remove them from </w:t>
-            </w:r>
-            <w:r>
-              <w:rPr>
-                <w:sz w:val="19"/>
-                <w:szCs w:val="19"/>
-              </w:rPr>
-              <w:t>Marketing in the phone and desktop apps; 12 at most.</w:t>
+              <w:t>Bulk order pictures: example photos of real bulk orders play as a slideshow on the website's Bulk Orders page (whole picture, optional caption, moves on every 5 seconds). Marketers, Admins and the S</w:t>
+            </w:r>
+            <w:r>
+              <w:rPr>
+                <w:sz w:val="19"/>
+                <w:szCs w:val="19"/>
+              </w:rPr>
+              <w:t>uperAdmin add, caption, put in order and remove them from Marketing in the phone and desktop apps; 12 at most.</w:t>
             </w:r>
           </w:p>
         </w:tc>
@@ -14387,14 +14341,7 @@
                 <w:sz w:val="19"/>
                 <w:szCs w:val="19"/>
               </w:rPr>
-              <w:t>Bulk Orders emails go to the orders desk (the +orders address), and its replies come from there; the Help page keeps +support. A signed-in customer's phone number is filled in for them in the</w:t>
-            </w:r>
-            <w:r>
-              <w:rPr>
-                <w:sz w:val="19"/>
-                <w:szCs w:val="19"/>
-              </w:rPr>
-              <w:t xml:space="preserve"> email window and at checkout.</w:t>
+              <w:t>Bulk Orders emails go to the orders desk (the +orders address), and its replies come from there; the Help page keeps +support. A signed-in customer's phone number is filled in for them in the email window and at checkout.</w:t>
             </w:r>
           </w:p>
         </w:tc>
@@ -14890,229 +14837,229 @@
 <file path=word/numbering.xml><?xml version="1.0" encoding="utf-8"?>
 <w:numbering xmlns:wpc="http://schemas.microsoft.com/office/word/2010/wordprocessingCanvas" xmlns:cx="http://schemas.microsoft.com/office/drawing/2014/chartex" xmlns:cx1="http://schemas.microsoft.com/office/drawing/2015/9/8/chartex" xmlns:mc="http://schemas.openxmlformats.org/markup-compatibility/2006" xmlns:o="urn:schemas-microsoft-com:office:office" xmlns:r="http://schemas.openxmlformats.org/officeDocument/2006/relationships" xmlns:m="http://schemas.openxmlformats.org/officeDocument/2006/math" xmlns:v="urn:schemas-microsoft-com:vml" xmlns:wp14="http://schemas.microsoft.com/office/word/2010/wordprocessingDrawing" xmlns:wp="http://schemas.openxmlformats.org/drawingml/2006/wordprocessingDrawing" xmlns:w10="urn:schemas-microsoft-com:office:word" xmlns:w="http://schemas.openxmlformats.org/wordprocessingml/2006/main" xmlns:w14="http://schemas.microsoft.com/office/word/2010/wordml" xmlns:w15="http://schemas.microsoft.com/office/word/2012/wordml" xmlns:w16se="http://schemas.microsoft.com/office/word/2015/wordml/symex" xmlns:wpg="http://schemas.microsoft.com/office/word/2010/wordprocessingGroup" xmlns:wpi="http://schemas.microsoft.com/office/word/2010/wordprocessingInk" xmlns:wne="http://schemas.microsoft.com/office/word/2006/wordml" xmlns:wps="http://schemas.microsoft.com/office/word/2010/wordprocessingShape" mc:Ignorable="w14 w15 w16se wp14">
   <w:abstractNum w:abstractNumId="0" w15:restartNumberingAfterBreak="0">
-    <w:nsid w:val="05B645CF"/>
+    <w:nsid w:val="08ED0FDE"/>
     <w:multiLevelType w:val="hybridMultilevel"/>
-    <w:tmpl w:val="B266638A"/>
-    <w:lvl w:ilvl="0" w:tplc="FB7A2260">
+    <w:tmpl w:val="C1685710"/>
+    <w:lvl w:ilvl="0" w:tplc="58C02E84" w:tentative="1">
       <w:start w:val="1"/>
-      <w:numFmt w:val="decimal"/>
-      <w:lvlText w:val="%1."/>
+      <w:numFmt w:val="bullet"/>
+      <w:lvlText w:val="●"/>
       <w:lvlJc w:val="left"/>
       <w:pPr>
+        <w:ind w:left="720" w:hanging="360"/>
+      </w:pPr>
+    </w:lvl>
+    <w:lvl w:ilvl="1" w:tplc="EE28054E" w:tentative="1">
+      <w:start w:val="1"/>
+      <w:numFmt w:val="bullet"/>
+      <w:lvlText w:val="○"/>
+      <w:lvlJc w:val="left"/>
+      <w:pPr>
+        <w:ind w:left="1440" w:hanging="360"/>
+      </w:pPr>
+    </w:lvl>
+    <w:lvl w:ilvl="2" w:tplc="F8544E40" w:tentative="1">
+      <w:start w:val="1"/>
+      <w:numFmt w:val="bullet"/>
+      <w:lvlText w:val="■"/>
+      <w:lvlJc w:val="left"/>
+      <w:pPr>
+        <w:ind w:left="2160" w:hanging="360"/>
+      </w:pPr>
+    </w:lvl>
+    <w:lvl w:ilvl="3" w:tplc="793A3944" w:tentative="1">
+      <w:start w:val="1"/>
+      <w:numFmt w:val="bullet"/>
+      <w:lvlText w:val="●"/>
+      <w:lvlJc w:val="left"/>
+      <w:pPr>
+        <w:ind w:left="2880" w:hanging="360"/>
+      </w:pPr>
+    </w:lvl>
+    <w:lvl w:ilvl="4" w:tplc="4BFEA768" w:tentative="1">
+      <w:start w:val="1"/>
+      <w:numFmt w:val="bullet"/>
+      <w:lvlText w:val="○"/>
+      <w:lvlJc w:val="left"/>
+      <w:pPr>
+        <w:ind w:left="3600" w:hanging="360"/>
+      </w:pPr>
+    </w:lvl>
+    <w:lvl w:ilvl="5" w:tplc="BC8CDBB4" w:tentative="1">
+      <w:start w:val="1"/>
+      <w:numFmt w:val="bullet"/>
+      <w:lvlText w:val="■"/>
+      <w:lvlJc w:val="left"/>
+      <w:pPr>
+        <w:ind w:left="4320" w:hanging="360"/>
+      </w:pPr>
+    </w:lvl>
+    <w:lvl w:ilvl="6" w:tplc="33F6F688" w:tentative="1">
+      <w:start w:val="1"/>
+      <w:numFmt w:val="bullet"/>
+      <w:lvlText w:val="●"/>
+      <w:lvlJc w:val="left"/>
+      <w:pPr>
+        <w:ind w:left="5040" w:hanging="360"/>
+      </w:pPr>
+    </w:lvl>
+    <w:lvl w:ilvl="7" w:tplc="406CE29C" w:tentative="1">
+      <w:start w:val="1"/>
+      <w:numFmt w:val="bullet"/>
+      <w:lvlText w:val="●"/>
+      <w:lvlJc w:val="left"/>
+      <w:pPr>
+        <w:ind w:left="5760" w:hanging="360"/>
+      </w:pPr>
+    </w:lvl>
+    <w:lvl w:ilvl="8" w:tplc="13CE4146" w:tentative="1">
+      <w:start w:val="1"/>
+      <w:numFmt w:val="bullet"/>
+      <w:lvlText w:val="●"/>
+      <w:lvlJc w:val="left"/>
+      <w:pPr>
+        <w:ind w:left="6480" w:hanging="360"/>
+      </w:pPr>
+    </w:lvl>
+  </w:abstractNum>
+  <w:abstractNum w:abstractNumId="1" w15:restartNumberingAfterBreak="0">
+    <w:nsid w:val="39FD513E"/>
+    <w:multiLevelType w:val="hybridMultilevel"/>
+    <w:tmpl w:val="0CB0F9D4"/>
+    <w:lvl w:ilvl="0" w:tplc="CBEA6480">
+      <w:start w:val="1"/>
+      <w:numFmt w:val="bullet"/>
+      <w:lvlText w:val="•"/>
+      <w:lvlJc w:val="left"/>
+      <w:pPr>
         <w:ind w:left="540" w:hanging="300"/>
       </w:pPr>
     </w:lvl>
-    <w:lvl w:ilvl="1" w:tplc="138656B0" w:tentative="1">
+    <w:lvl w:ilvl="1" w:tplc="125EDF4E" w:tentative="1">
       <w:start w:val="1"/>
-      <w:numFmt w:val="lowerLetter"/>
-      <w:lvlText w:val="%2."/>
+      <w:numFmt w:val="bullet"/>
+      <w:lvlText w:val="–"/>
       <w:lvlJc w:val="left"/>
       <w:pPr>
         <w:ind w:left="940" w:hanging="300"/>
       </w:pPr>
     </w:lvl>
-    <w:lvl w:ilvl="2" w:tplc="FD28B410" w:tentative="1">
+    <w:lvl w:ilvl="2" w:tplc="50D8D336" w:tentative="1">
       <w:start w:val="1"/>
-      <w:numFmt w:val="lowerRoman"/>
-      <w:lvlText w:val="%3."/>
+      <w:numFmt w:val="bullet"/>
+      <w:lvlText w:val="◦"/>
       <w:lvlJc w:val="left"/>
       <w:pPr>
         <w:ind w:left="1340" w:hanging="300"/>
       </w:pPr>
     </w:lvl>
-    <w:lvl w:ilvl="3" w:tplc="64D49658">
+    <w:lvl w:ilvl="3" w:tplc="746A8D04">
       <w:numFmt w:val="decimal"/>
       <w:lvlText w:val=""/>
       <w:lvlJc w:val="left"/>
     </w:lvl>
-    <w:lvl w:ilvl="4" w:tplc="23ACD2DE">
+    <w:lvl w:ilvl="4" w:tplc="7E5ADA26">
       <w:numFmt w:val="decimal"/>
       <w:lvlText w:val=""/>
       <w:lvlJc w:val="left"/>
     </w:lvl>
-    <w:lvl w:ilvl="5" w:tplc="0486CBAA">
+    <w:lvl w:ilvl="5" w:tplc="9F6C73A4">
       <w:numFmt w:val="decimal"/>
       <w:lvlText w:val=""/>
       <w:lvlJc w:val="left"/>
     </w:lvl>
-    <w:lvl w:ilvl="6" w:tplc="BD5ABFF8">
+    <w:lvl w:ilvl="6" w:tplc="F336E388">
       <w:numFmt w:val="decimal"/>
       <w:lvlText w:val=""/>
       <w:lvlJc w:val="left"/>
     </w:lvl>
-    <w:lvl w:ilvl="7" w:tplc="1972AA34">
+    <w:lvl w:ilvl="7" w:tplc="91D646C8">
       <w:numFmt w:val="decimal"/>
       <w:lvlText w:val=""/>
       <w:lvlJc w:val="left"/>
     </w:lvl>
-    <w:lvl w:ilvl="8" w:tplc="3D1CE020">
+    <w:lvl w:ilvl="8" w:tplc="C61258A4">
       <w:numFmt w:val="decimal"/>
       <w:lvlText w:val=""/>
       <w:lvlJc w:val="left"/>
     </w:lvl>
   </w:abstractNum>
-  <w:abstractNum w:abstractNumId="1" w15:restartNumberingAfterBreak="0">
-    <w:nsid w:val="342F1D07"/>
+  <w:abstractNum w:abstractNumId="2" w15:restartNumberingAfterBreak="0">
+    <w:nsid w:val="740652C9"/>
     <w:multiLevelType w:val="hybridMultilevel"/>
-    <w:tmpl w:val="AE44E2CE"/>
-    <w:lvl w:ilvl="0" w:tplc="AB16DCB2" w:tentative="1">
+    <w:tmpl w:val="47748082"/>
+    <w:lvl w:ilvl="0" w:tplc="69FA02A4">
       <w:start w:val="1"/>
-      <w:numFmt w:val="bullet"/>
-      <w:lvlText w:val="●"/>
+      <w:numFmt w:val="decimal"/>
+      <w:lvlText w:val="%1."/>
       <w:lvlJc w:val="left"/>
       <w:pPr>
-        <w:ind w:left="720" w:hanging="360"/>
+        <w:ind w:left="540" w:hanging="300"/>
       </w:pPr>
     </w:lvl>
-    <w:lvl w:ilvl="1" w:tplc="405C8792" w:tentative="1">
+    <w:lvl w:ilvl="1" w:tplc="9C981276" w:tentative="1">
       <w:start w:val="1"/>
-      <w:numFmt w:val="bullet"/>
-      <w:lvlText w:val="○"/>
+      <w:numFmt w:val="lowerLetter"/>
+      <w:lvlText w:val="%2."/>
       <w:lvlJc w:val="left"/>
       <w:pPr>
-        <w:ind w:left="1440" w:hanging="360"/>
+        <w:ind w:left="940" w:hanging="300"/>
       </w:pPr>
     </w:lvl>
-    <w:lvl w:ilvl="2" w:tplc="7A0A2E9C" w:tentative="1">
+    <w:lvl w:ilvl="2" w:tplc="AC3ABFF6" w:tentative="1">
       <w:start w:val="1"/>
-      <w:numFmt w:val="bullet"/>
-      <w:lvlText w:val="■"/>
+      <w:numFmt w:val="lowerRoman"/>
+      <w:lvlText w:val="%3."/>
       <w:lvlJc w:val="left"/>
       <w:pPr>
-        <w:ind w:left="2160" w:hanging="360"/>
+        <w:ind w:left="1340" w:hanging="300"/>
       </w:pPr>
     </w:lvl>
-    <w:lvl w:ilvl="3" w:tplc="5B5AE6C8" w:tentative="1">
-      <w:start w:val="1"/>
-      <w:numFmt w:val="bullet"/>
-      <w:lvlText w:val="●"/>
-      <w:lvlJc w:val="left"/>
-      <w:pPr>
-        <w:ind w:left="2880" w:hanging="360"/>
-      </w:pPr>
-    </w:lvl>
-    <w:lvl w:ilvl="4" w:tplc="2BE2ECD2" w:tentative="1">
-      <w:start w:val="1"/>
-      <w:numFmt w:val="bullet"/>
-      <w:lvlText w:val="○"/>
-      <w:lvlJc w:val="left"/>
-      <w:pPr>
-        <w:ind w:left="3600" w:hanging="360"/>
-      </w:pPr>
-    </w:lvl>
-    <w:lvl w:ilvl="5" w:tplc="FAFC2376" w:tentative="1">
-      <w:start w:val="1"/>
-      <w:numFmt w:val="bullet"/>
-      <w:lvlText w:val="■"/>
-      <w:lvlJc w:val="left"/>
-      <w:pPr>
-        <w:ind w:left="4320" w:hanging="360"/>
-      </w:pPr>
-    </w:lvl>
-    <w:lvl w:ilvl="6" w:tplc="C58627CE" w:tentative="1">
-      <w:start w:val="1"/>
-      <w:numFmt w:val="bullet"/>
-      <w:lvlText w:val="●"/>
-      <w:lvlJc w:val="left"/>
-      <w:pPr>
-        <w:ind w:left="5040" w:hanging="360"/>
-      </w:pPr>
-    </w:lvl>
-    <w:lvl w:ilvl="7" w:tplc="5986ECA2" w:tentative="1">
-      <w:start w:val="1"/>
-      <w:numFmt w:val="bullet"/>
-      <w:lvlText w:val="●"/>
-      <w:lvlJc w:val="left"/>
-      <w:pPr>
-        <w:ind w:left="5760" w:hanging="360"/>
-      </w:pPr>
-    </w:lvl>
-    <w:lvl w:ilvl="8" w:tplc="859E6628" w:tentative="1">
-      <w:start w:val="1"/>
-      <w:numFmt w:val="bullet"/>
-      <w:lvlText w:val="●"/>
-      <w:lvlJc w:val="left"/>
-      <w:pPr>
-        <w:ind w:left="6480" w:hanging="360"/>
-      </w:pPr>
-    </w:lvl>
-  </w:abstractNum>
-  <w:abstractNum w:abstractNumId="2" w15:restartNumberingAfterBreak="0">
-    <w:nsid w:val="4028783B"/>
-    <w:multiLevelType w:val="hybridMultilevel"/>
-    <w:tmpl w:val="6B56590E"/>
-    <w:lvl w:ilvl="0" w:tplc="EBD612A2">
-      <w:start w:val="1"/>
-      <w:numFmt w:val="bullet"/>
-      <w:lvlText w:val="•"/>
-      <w:lvlJc w:val="left"/>
-      <w:pPr>
-        <w:ind w:left="540" w:hanging="300"/>
-      </w:pPr>
-    </w:lvl>
-    <w:lvl w:ilvl="1" w:tplc="17103F48" w:tentative="1">
-      <w:start w:val="1"/>
-      <w:numFmt w:val="bullet"/>
-      <w:lvlText w:val="–"/>
-      <w:lvlJc w:val="left"/>
-      <w:pPr>
-        <w:ind w:left="940" w:hanging="300"/>
-      </w:pPr>
-    </w:lvl>
-    <w:lvl w:ilvl="2" w:tplc="1B74A6D6" w:tentative="1">
-      <w:start w:val="1"/>
-      <w:numFmt w:val="bullet"/>
-      <w:lvlText w:val="◦"/>
-      <w:lvlJc w:val="left"/>
-      <w:pPr>
-        <w:ind w:left="1340" w:hanging="300"/>
-      </w:pPr>
-    </w:lvl>
-    <w:lvl w:ilvl="3" w:tplc="106E9F14">
+    <w:lvl w:ilvl="3" w:tplc="DFA8BA88">
       <w:numFmt w:val="decimal"/>
       <w:lvlText w:val=""/>
       <w:lvlJc w:val="left"/>
     </w:lvl>
-    <w:lvl w:ilvl="4" w:tplc="747423CC">
+    <w:lvl w:ilvl="4" w:tplc="79288164">
       <w:numFmt w:val="decimal"/>
       <w:lvlText w:val=""/>
       <w:lvlJc w:val="left"/>
     </w:lvl>
-    <w:lvl w:ilvl="5" w:tplc="9634B10E">
+    <w:lvl w:ilvl="5" w:tplc="51E6385C">
       <w:numFmt w:val="decimal"/>
       <w:lvlText w:val=""/>
       <w:lvlJc w:val="left"/>
     </w:lvl>
-    <w:lvl w:ilvl="6" w:tplc="196A79C4">
+    <w:lvl w:ilvl="6" w:tplc="8B6AFE1E">
       <w:numFmt w:val="decimal"/>
       <w:lvlText w:val=""/>
       <w:lvlJc w:val="left"/>
     </w:lvl>
-    <w:lvl w:ilvl="7" w:tplc="F74A6A78">
+    <w:lvl w:ilvl="7" w:tplc="6DC237A2">
       <w:numFmt w:val="decimal"/>
       <w:lvlText w:val=""/>
       <w:lvlJc w:val="left"/>
     </w:lvl>
-    <w:lvl w:ilvl="8" w:tplc="01628364">
+    <w:lvl w:ilvl="8" w:tplc="A0C41D5A">
       <w:numFmt w:val="decimal"/>
       <w:lvlText w:val=""/>
       <w:lvlJc w:val="left"/>
     </w:lvl>
   </w:abstractNum>
   <w:num w:numId="1">
+    <w:abstractNumId w:val="0"/>
+    <w:lvlOverride w:ilvl="0">
+      <w:startOverride w:val="1"/>
+    </w:lvlOverride>
+  </w:num>
+  <w:num w:numId="2">
     <w:abstractNumId w:val="1"/>
     <w:lvlOverride w:ilvl="0">
       <w:startOverride w:val="1"/>
     </w:lvlOverride>
   </w:num>
-  <w:num w:numId="2">
+  <w:num w:numId="3">
     <w:abstractNumId w:val="2"/>
-    <w:lvlOverride w:ilvl="0">
-      <w:startOverride w:val="1"/>
-    </w:lvlOverride>
-  </w:num>
-  <w:num w:numId="3">
-    <w:abstractNumId w:val="0"/>
     <w:lvlOverride w:ilvl="0">
       <w:startOverride w:val="1"/>
     </w:lvlOverride>
@@ -15741,7 +15688,7 @@
     <w:autoRedefine/>
     <w:uiPriority w:val="39"/>
     <w:unhideWhenUsed/>
-    <w:rsid w:val="00CA50B0"/>
+    <w:rsid w:val="0073611D"/>
     <w:pPr>
       <w:spacing w:after="100"/>
     </w:pPr>
@@ -15753,7 +15700,7 @@
     <w:autoRedefine/>
     <w:uiPriority w:val="39"/>
     <w:unhideWhenUsed/>
-    <w:rsid w:val="00CA50B0"/>
+    <w:rsid w:val="0073611D"/>
     <w:pPr>
       <w:spacing w:after="100"/>
       <w:ind w:left="210"/>

</xml_diff>